<commit_message>
Aula 1203 - FRONT - Término aula 05 e 06
</commit_message>
<xml_diff>
--- a/SENAI/WORDS/3º SEMESTRE/Front-end/aula05_dom.docx
+++ b/SENAI/WORDS/3º SEMESTRE/Front-end/aula05_dom.docx
@@ -571,6 +571,7 @@
       <w:r>
         <w:rPr>
           <w:rFonts w:ascii="Arial" w:hAnsi="Arial"/>
+          <w:noProof/>
           <w:sz w:val="28"/>
           <w:szCs w:val="28"/>
         </w:rPr>
@@ -1059,31 +1060,7 @@
           <w:sz w:val="28"/>
           <w:szCs w:val="28"/>
         </w:rPr>
-        <w:t>document.getElement</w:t>
-      </w:r>
-      <w:r>
-        <w:rPr>
-          <w:rFonts w:ascii="Arial" w:hAnsi="Arial"/>
-          <w:sz w:val="28"/>
-          <w:szCs w:val="28"/>
-        </w:rPr>
-        <w:t>s</w:t>
-      </w:r>
-      <w:r>
-        <w:rPr>
-          <w:rFonts w:ascii="Arial" w:hAnsi="Arial"/>
-          <w:sz w:val="28"/>
-          <w:szCs w:val="28"/>
-        </w:rPr>
-        <w:t>By</w:t>
-      </w:r>
-      <w:r>
-        <w:rPr>
-          <w:rFonts w:ascii="Arial" w:hAnsi="Arial"/>
-          <w:sz w:val="28"/>
-          <w:szCs w:val="28"/>
-        </w:rPr>
-        <w:t>Class</w:t>
+        <w:t>document.getElementsByClass</w:t>
       </w:r>
       <w:proofErr w:type="spellEnd"/>
       <w:proofErr w:type="gramEnd"/>
@@ -1117,15 +1094,7 @@
           <w:sz w:val="28"/>
           <w:szCs w:val="28"/>
         </w:rPr>
-        <w:t xml:space="preserve"> Busca o elemento </w:t>
-      </w:r>
-      <w:r>
-        <w:rPr>
-          <w:rFonts w:ascii="Arial" w:hAnsi="Arial"/>
-          <w:sz w:val="28"/>
-          <w:szCs w:val="28"/>
-        </w:rPr>
-        <w:t>pela sua classe (</w:t>
+        <w:t xml:space="preserve"> Busca o elemento pela sua classe (</w:t>
       </w:r>
       <w:r>
         <w:rPr>
@@ -1420,23 +1389,7 @@
           <w:sz w:val="28"/>
           <w:szCs w:val="28"/>
         </w:rPr>
-        <w:t>: Altera apenas o texto puro. É mais performático e seguro, pois o navegador não</w:t>
-      </w:r>
-      <w:r>
-        <w:rPr>
-          <w:rFonts w:ascii="Arial" w:hAnsi="Arial"/>
-          <w:sz w:val="28"/>
-          <w:szCs w:val="28"/>
-        </w:rPr>
-        <w:t xml:space="preserve"> </w:t>
-      </w:r>
-      <w:r>
-        <w:rPr>
-          <w:rFonts w:ascii="Arial" w:hAnsi="Arial"/>
-          <w:sz w:val="28"/>
-          <w:szCs w:val="28"/>
-        </w:rPr>
-        <w:t>tenta "entender" o que você escreveu como código.</w:t>
+        <w:t>: Altera apenas o texto puro. É mais performático e seguro, pois o navegador não tenta "entender" o que você escreveu como código.</w:t>
       </w:r>
     </w:p>
     <w:p>
@@ -1490,23 +1443,7 @@
           <w:sz w:val="28"/>
           <w:szCs w:val="28"/>
         </w:rPr>
-        <w:t xml:space="preserve"> HTML. Se você escrever</w:t>
-      </w:r>
-      <w:r>
-        <w:rPr>
-          <w:rFonts w:ascii="Arial" w:hAnsi="Arial"/>
-          <w:sz w:val="28"/>
-          <w:szCs w:val="28"/>
-        </w:rPr>
-        <w:t xml:space="preserve">: </w:t>
-      </w:r>
-      <w:r>
-        <w:rPr>
-          <w:rFonts w:ascii="Arial" w:hAnsi="Arial"/>
-          <w:sz w:val="28"/>
-          <w:szCs w:val="28"/>
-        </w:rPr>
-        <w:t>&lt;</w:t>
+        <w:t xml:space="preserve"> HTML. Se você escrever: &lt;</w:t>
       </w:r>
       <w:proofErr w:type="spellStart"/>
       <w:r>
@@ -1718,6 +1655,7 @@
           <w:rFonts w:ascii="Arial" w:hAnsi="Arial"/>
           <w:b/>
           <w:bCs/>
+          <w:noProof/>
           <w:sz w:val="28"/>
           <w:szCs w:val="28"/>
         </w:rPr>
@@ -1758,6 +1696,1423 @@
           </wp:inline>
         </w:drawing>
       </w:r>
+    </w:p>
+    <w:p>
+      <w:pPr>
+        <w:rPr>
+          <w:rFonts w:ascii="Arial" w:hAnsi="Arial"/>
+          <w:b/>
+          <w:bCs/>
+          <w:sz w:val="28"/>
+          <w:szCs w:val="28"/>
+        </w:rPr>
+      </w:pPr>
+    </w:p>
+    <w:p>
+      <w:pPr>
+        <w:rPr>
+          <w:rFonts w:ascii="Arial" w:hAnsi="Arial"/>
+          <w:sz w:val="28"/>
+          <w:szCs w:val="28"/>
+        </w:rPr>
+      </w:pPr>
+      <w:r>
+        <w:rPr>
+          <w:rFonts w:ascii="Arial" w:hAnsi="Arial"/>
+          <w:b/>
+          <w:bCs/>
+          <w:sz w:val="28"/>
+          <w:szCs w:val="28"/>
+        </w:rPr>
+        <w:t xml:space="preserve">Manipulando Atributos </w:t>
+      </w:r>
+      <w:r>
+        <w:rPr>
+          <w:rFonts w:ascii="Arial" w:hAnsi="Arial"/>
+          <w:b/>
+          <w:bCs/>
+          <w:sz w:val="28"/>
+          <w:szCs w:val="28"/>
+        </w:rPr>
+        <w:t>- Antigo</w:t>
+      </w:r>
+    </w:p>
+    <w:p>
+      <w:pPr>
+        <w:rPr>
+          <w:rFonts w:ascii="Arial" w:hAnsi="Arial"/>
+          <w:sz w:val="28"/>
+          <w:szCs w:val="28"/>
+        </w:rPr>
+      </w:pPr>
+      <w:r>
+        <w:rPr>
+          <w:rFonts w:ascii="Arial" w:hAnsi="Arial"/>
+          <w:sz w:val="28"/>
+          <w:szCs w:val="28"/>
+        </w:rPr>
+        <w:t xml:space="preserve">É possível alterar atributos de elementos HTML pelo JS, como o </w:t>
+      </w:r>
+      <w:proofErr w:type="spellStart"/>
+      <w:r>
+        <w:rPr>
+          <w:rFonts w:ascii="Arial" w:hAnsi="Arial"/>
+          <w:sz w:val="28"/>
+          <w:szCs w:val="28"/>
+        </w:rPr>
+        <w:t>src</w:t>
+      </w:r>
+      <w:proofErr w:type="spellEnd"/>
+      <w:r>
+        <w:rPr>
+          <w:rFonts w:ascii="Arial" w:hAnsi="Arial"/>
+          <w:sz w:val="28"/>
+          <w:szCs w:val="28"/>
+        </w:rPr>
+        <w:t xml:space="preserve"> de uma imagem, o link de um texto, ou um alt. </w:t>
+      </w:r>
+      <w:r>
+        <w:rPr>
+          <w:rFonts w:ascii="Arial" w:hAnsi="Arial"/>
+          <w:sz w:val="28"/>
+          <w:szCs w:val="28"/>
+        </w:rPr>
+        <w:t>Para fazer isso, o JS precisa ler (</w:t>
+      </w:r>
+      <w:proofErr w:type="spellStart"/>
+      <w:r>
+        <w:rPr>
+          <w:rFonts w:ascii="Arial" w:hAnsi="Arial"/>
+          <w:sz w:val="28"/>
+          <w:szCs w:val="28"/>
+        </w:rPr>
+        <w:t>getAt</w:t>
+      </w:r>
+      <w:r>
+        <w:rPr>
+          <w:rFonts w:ascii="Arial" w:hAnsi="Arial"/>
+          <w:sz w:val="28"/>
+          <w:szCs w:val="28"/>
+        </w:rPr>
+        <w:t>r</w:t>
+      </w:r>
+      <w:r>
+        <w:rPr>
+          <w:rFonts w:ascii="Arial" w:hAnsi="Arial"/>
+          <w:sz w:val="28"/>
+          <w:szCs w:val="28"/>
+        </w:rPr>
+        <w:t>ribut</w:t>
+      </w:r>
+      <w:r>
+        <w:rPr>
+          <w:rFonts w:ascii="Arial" w:hAnsi="Arial"/>
+          <w:sz w:val="28"/>
+          <w:szCs w:val="28"/>
+        </w:rPr>
+        <w:t>e</w:t>
+      </w:r>
+      <w:proofErr w:type="spellEnd"/>
+      <w:r>
+        <w:rPr>
+          <w:rFonts w:ascii="Arial" w:hAnsi="Arial"/>
+          <w:sz w:val="28"/>
+          <w:szCs w:val="28"/>
+        </w:rPr>
+        <w:t xml:space="preserve">) </w:t>
+      </w:r>
+      <w:r>
+        <w:rPr>
+          <w:rFonts w:ascii="Arial" w:hAnsi="Arial"/>
+          <w:sz w:val="28"/>
+          <w:szCs w:val="28"/>
+        </w:rPr>
+        <w:t>e/ou alterar (</w:t>
+      </w:r>
+      <w:proofErr w:type="spellStart"/>
+      <w:r>
+        <w:rPr>
+          <w:rFonts w:ascii="Arial" w:hAnsi="Arial"/>
+          <w:sz w:val="28"/>
+          <w:szCs w:val="28"/>
+        </w:rPr>
+        <w:t>setAtt</w:t>
+      </w:r>
+      <w:r>
+        <w:rPr>
+          <w:rFonts w:ascii="Arial" w:hAnsi="Arial"/>
+          <w:sz w:val="28"/>
+          <w:szCs w:val="28"/>
+        </w:rPr>
+        <w:t>ribute</w:t>
+      </w:r>
+      <w:proofErr w:type="spellEnd"/>
+      <w:r>
+        <w:rPr>
+          <w:rFonts w:ascii="Arial" w:hAnsi="Arial"/>
+          <w:sz w:val="28"/>
+          <w:szCs w:val="28"/>
+        </w:rPr>
+        <w:t xml:space="preserve">), como trocar uma imagem de forma </w:t>
+      </w:r>
+      <w:proofErr w:type="spellStart"/>
+      <w:r>
+        <w:rPr>
+          <w:rFonts w:ascii="Arial" w:hAnsi="Arial"/>
+          <w:sz w:val="28"/>
+          <w:szCs w:val="28"/>
+        </w:rPr>
+        <w:t>dinâmino</w:t>
+      </w:r>
+      <w:proofErr w:type="spellEnd"/>
+    </w:p>
+    <w:p>
+      <w:pPr>
+        <w:rPr>
+          <w:rFonts w:ascii="Arial" w:hAnsi="Arial"/>
+          <w:sz w:val="28"/>
+          <w:szCs w:val="28"/>
+        </w:rPr>
+      </w:pPr>
+    </w:p>
+    <w:p>
+      <w:pPr>
+        <w:rPr>
+          <w:rFonts w:ascii="Arial" w:hAnsi="Arial"/>
+          <w:b/>
+          <w:bCs/>
+          <w:sz w:val="28"/>
+          <w:szCs w:val="28"/>
+        </w:rPr>
+      </w:pPr>
+      <w:r>
+        <w:rPr>
+          <w:rFonts w:ascii="Arial" w:hAnsi="Arial"/>
+          <w:b/>
+          <w:bCs/>
+          <w:sz w:val="28"/>
+          <w:szCs w:val="28"/>
+        </w:rPr>
+        <w:t>Novos</w:t>
+      </w:r>
+    </w:p>
+    <w:p>
+      <w:pPr>
+        <w:rPr>
+          <w:rFonts w:ascii="Arial" w:hAnsi="Arial"/>
+          <w:b/>
+          <w:bCs/>
+          <w:sz w:val="28"/>
+          <w:szCs w:val="28"/>
+        </w:rPr>
+      </w:pPr>
+      <w:r>
+        <w:rPr>
+          <w:rFonts w:ascii="Arial" w:hAnsi="Arial"/>
+          <w:sz w:val="28"/>
+          <w:szCs w:val="28"/>
+        </w:rPr>
+        <w:t xml:space="preserve">O elemento é tratado como </w:t>
+      </w:r>
+      <w:r>
+        <w:rPr>
+          <w:rFonts w:ascii="Arial" w:hAnsi="Arial"/>
+          <w:sz w:val="28"/>
+          <w:szCs w:val="28"/>
+        </w:rPr>
+        <w:t xml:space="preserve">um </w:t>
+      </w:r>
+      <w:r>
+        <w:rPr>
+          <w:rFonts w:ascii="Arial" w:hAnsi="Arial"/>
+          <w:b/>
+          <w:bCs/>
+          <w:sz w:val="28"/>
+          <w:szCs w:val="28"/>
+        </w:rPr>
+        <w:t>OBJETO JS</w:t>
+      </w:r>
+    </w:p>
+    <w:p>
+      <w:pPr>
+        <w:rPr>
+          <w:rFonts w:ascii="Arial" w:hAnsi="Arial"/>
+          <w:b/>
+          <w:bCs/>
+          <w:sz w:val="28"/>
+          <w:szCs w:val="28"/>
+        </w:rPr>
+      </w:pPr>
+      <w:r>
+        <w:rPr>
+          <w:rFonts w:ascii="Arial" w:hAnsi="Arial"/>
+          <w:b/>
+          <w:bCs/>
+          <w:sz w:val="28"/>
+          <w:szCs w:val="28"/>
+        </w:rPr>
+        <w:drawing>
+          <wp:inline distT="0" distB="0" distL="0" distR="0" wp14:anchorId="07EEFBB2" wp14:editId="6436A77D">
+            <wp:extent cx="5400040" cy="2019935"/>
+            <wp:effectExtent l="0" t="0" r="0" b="0"/>
+            <wp:docPr id="863811904" name="Imagem 1"/>
+            <wp:cNvGraphicFramePr>
+              <a:graphicFrameLocks xmlns:a="http://schemas.openxmlformats.org/drawingml/2006/main" noChangeAspect="1"/>
+            </wp:cNvGraphicFramePr>
+            <a:graphic xmlns:a="http://schemas.openxmlformats.org/drawingml/2006/main">
+              <a:graphicData uri="http://schemas.openxmlformats.org/drawingml/2006/picture">
+                <pic:pic xmlns:pic="http://schemas.openxmlformats.org/drawingml/2006/picture">
+                  <pic:nvPicPr>
+                    <pic:cNvPr id="863811904" name=""/>
+                    <pic:cNvPicPr/>
+                  </pic:nvPicPr>
+                  <pic:blipFill>
+                    <a:blip r:embed="rId7"/>
+                    <a:stretch>
+                      <a:fillRect/>
+                    </a:stretch>
+                  </pic:blipFill>
+                  <pic:spPr>
+                    <a:xfrm>
+                      <a:off x="0" y="0"/>
+                      <a:ext cx="5400040" cy="2019935"/>
+                    </a:xfrm>
+                    <a:prstGeom prst="rect">
+                      <a:avLst/>
+                    </a:prstGeom>
+                  </pic:spPr>
+                </pic:pic>
+              </a:graphicData>
+            </a:graphic>
+          </wp:inline>
+        </w:drawing>
+      </w:r>
+    </w:p>
+    <w:p>
+      <w:pPr>
+        <w:rPr>
+          <w:rFonts w:ascii="Arial" w:hAnsi="Arial"/>
+          <w:b/>
+          <w:bCs/>
+          <w:sz w:val="28"/>
+          <w:szCs w:val="28"/>
+        </w:rPr>
+      </w:pPr>
+      <w:r>
+        <w:rPr>
+          <w:rFonts w:ascii="Arial" w:hAnsi="Arial"/>
+          <w:b/>
+          <w:bCs/>
+          <w:sz w:val="28"/>
+          <w:szCs w:val="28"/>
+        </w:rPr>
+        <w:drawing>
+          <wp:inline distT="0" distB="0" distL="0" distR="0" wp14:anchorId="10CBC79B" wp14:editId="0A647D8A">
+            <wp:extent cx="5400040" cy="2400935"/>
+            <wp:effectExtent l="0" t="0" r="0" b="0"/>
+            <wp:docPr id="1791956023" name="Imagem 1"/>
+            <wp:cNvGraphicFramePr>
+              <a:graphicFrameLocks xmlns:a="http://schemas.openxmlformats.org/drawingml/2006/main" noChangeAspect="1"/>
+            </wp:cNvGraphicFramePr>
+            <a:graphic xmlns:a="http://schemas.openxmlformats.org/drawingml/2006/main">
+              <a:graphicData uri="http://schemas.openxmlformats.org/drawingml/2006/picture">
+                <pic:pic xmlns:pic="http://schemas.openxmlformats.org/drawingml/2006/picture">
+                  <pic:nvPicPr>
+                    <pic:cNvPr id="1791956023" name=""/>
+                    <pic:cNvPicPr/>
+                  </pic:nvPicPr>
+                  <pic:blipFill>
+                    <a:blip r:embed="rId8"/>
+                    <a:stretch>
+                      <a:fillRect/>
+                    </a:stretch>
+                  </pic:blipFill>
+                  <pic:spPr>
+                    <a:xfrm>
+                      <a:off x="0" y="0"/>
+                      <a:ext cx="5400040" cy="2400935"/>
+                    </a:xfrm>
+                    <a:prstGeom prst="rect">
+                      <a:avLst/>
+                    </a:prstGeom>
+                  </pic:spPr>
+                </pic:pic>
+              </a:graphicData>
+            </a:graphic>
+          </wp:inline>
+        </w:drawing>
+      </w:r>
+    </w:p>
+    <w:p>
+      <w:pPr>
+        <w:rPr>
+          <w:rFonts w:ascii="Arial" w:hAnsi="Arial"/>
+          <w:b/>
+          <w:bCs/>
+          <w:sz w:val="28"/>
+          <w:szCs w:val="28"/>
+        </w:rPr>
+      </w:pPr>
+      <w:r>
+        <w:rPr>
+          <w:rFonts w:ascii="Arial" w:hAnsi="Arial"/>
+          <w:b/>
+          <w:bCs/>
+          <w:sz w:val="28"/>
+          <w:szCs w:val="28"/>
+        </w:rPr>
+        <w:t>EXEMPLOS</w:t>
+      </w:r>
+      <w:r>
+        <w:rPr>
+          <w:rFonts w:ascii="Arial" w:hAnsi="Arial"/>
+          <w:b/>
+          <w:bCs/>
+          <w:sz w:val="28"/>
+          <w:szCs w:val="28"/>
+        </w:rPr>
+        <w:t xml:space="preserve"> (Mais em codigosnovos.js)</w:t>
+      </w:r>
+    </w:p>
+    <w:p>
+      <w:pPr>
+        <w:rPr>
+          <w:rFonts w:ascii="Arial" w:hAnsi="Arial"/>
+          <w:b/>
+          <w:bCs/>
+          <w:sz w:val="28"/>
+          <w:szCs w:val="28"/>
+        </w:rPr>
+      </w:pPr>
+      <w:r>
+        <w:rPr>
+          <w:rFonts w:ascii="Arial" w:hAnsi="Arial"/>
+          <w:b/>
+          <w:bCs/>
+          <w:sz w:val="28"/>
+          <w:szCs w:val="28"/>
+        </w:rPr>
+        <w:lastRenderedPageBreak/>
+        <w:t>Ex.:</w:t>
+      </w:r>
+    </w:p>
+    <w:p>
+      <w:pPr>
+        <w:rPr>
+          <w:rFonts w:ascii="Arial" w:hAnsi="Arial"/>
+          <w:b/>
+          <w:bCs/>
+          <w:sz w:val="28"/>
+          <w:szCs w:val="28"/>
+        </w:rPr>
+      </w:pPr>
+      <w:r>
+        <w:rPr>
+          <w:rFonts w:ascii="Arial" w:hAnsi="Arial"/>
+          <w:b/>
+          <w:bCs/>
+          <w:sz w:val="28"/>
+          <w:szCs w:val="28"/>
+        </w:rPr>
+        <w:drawing>
+          <wp:inline distT="0" distB="0" distL="0" distR="0" wp14:anchorId="1B53B249" wp14:editId="1F6B48D8">
+            <wp:extent cx="5400040" cy="734695"/>
+            <wp:effectExtent l="0" t="0" r="0" b="8255"/>
+            <wp:docPr id="330160238" name="Imagem 1"/>
+            <wp:cNvGraphicFramePr>
+              <a:graphicFrameLocks xmlns:a="http://schemas.openxmlformats.org/drawingml/2006/main" noChangeAspect="1"/>
+            </wp:cNvGraphicFramePr>
+            <a:graphic xmlns:a="http://schemas.openxmlformats.org/drawingml/2006/main">
+              <a:graphicData uri="http://schemas.openxmlformats.org/drawingml/2006/picture">
+                <pic:pic xmlns:pic="http://schemas.openxmlformats.org/drawingml/2006/picture">
+                  <pic:nvPicPr>
+                    <pic:cNvPr id="330160238" name=""/>
+                    <pic:cNvPicPr/>
+                  </pic:nvPicPr>
+                  <pic:blipFill>
+                    <a:blip r:embed="rId9"/>
+                    <a:stretch>
+                      <a:fillRect/>
+                    </a:stretch>
+                  </pic:blipFill>
+                  <pic:spPr>
+                    <a:xfrm>
+                      <a:off x="0" y="0"/>
+                      <a:ext cx="5400040" cy="734695"/>
+                    </a:xfrm>
+                    <a:prstGeom prst="rect">
+                      <a:avLst/>
+                    </a:prstGeom>
+                  </pic:spPr>
+                </pic:pic>
+              </a:graphicData>
+            </a:graphic>
+          </wp:inline>
+        </w:drawing>
+      </w:r>
+    </w:p>
+    <w:p>
+      <w:pPr>
+        <w:rPr>
+          <w:rFonts w:ascii="Arial" w:hAnsi="Arial"/>
+          <w:sz w:val="28"/>
+          <w:szCs w:val="28"/>
+        </w:rPr>
+      </w:pPr>
+      <w:r>
+        <w:rPr>
+          <w:rFonts w:ascii="Arial" w:hAnsi="Arial"/>
+          <w:sz w:val="28"/>
+          <w:szCs w:val="28"/>
+        </w:rPr>
+        <w:t>Selecionando elementos que terão atributos manipulados</w:t>
+      </w:r>
+    </w:p>
+    <w:p>
+      <w:pPr>
+        <w:rPr>
+          <w:rFonts w:ascii="Arial" w:hAnsi="Arial"/>
+          <w:sz w:val="28"/>
+          <w:szCs w:val="28"/>
+        </w:rPr>
+      </w:pPr>
+      <w:r>
+        <w:rPr>
+          <w:rFonts w:ascii="Arial" w:hAnsi="Arial"/>
+          <w:sz w:val="28"/>
+          <w:szCs w:val="28"/>
+        </w:rPr>
+        <w:drawing>
+          <wp:inline distT="0" distB="0" distL="0" distR="0" wp14:anchorId="6D8B2D6E" wp14:editId="369D50FF">
+            <wp:extent cx="5400040" cy="808990"/>
+            <wp:effectExtent l="0" t="0" r="0" b="0"/>
+            <wp:docPr id="1207119862" name="Imagem 1"/>
+            <wp:cNvGraphicFramePr>
+              <a:graphicFrameLocks xmlns:a="http://schemas.openxmlformats.org/drawingml/2006/main" noChangeAspect="1"/>
+            </wp:cNvGraphicFramePr>
+            <a:graphic xmlns:a="http://schemas.openxmlformats.org/drawingml/2006/main">
+              <a:graphicData uri="http://schemas.openxmlformats.org/drawingml/2006/picture">
+                <pic:pic xmlns:pic="http://schemas.openxmlformats.org/drawingml/2006/picture">
+                  <pic:nvPicPr>
+                    <pic:cNvPr id="1207119862" name=""/>
+                    <pic:cNvPicPr/>
+                  </pic:nvPicPr>
+                  <pic:blipFill>
+                    <a:blip r:embed="rId10"/>
+                    <a:stretch>
+                      <a:fillRect/>
+                    </a:stretch>
+                  </pic:blipFill>
+                  <pic:spPr>
+                    <a:xfrm>
+                      <a:off x="0" y="0"/>
+                      <a:ext cx="5400040" cy="808990"/>
+                    </a:xfrm>
+                    <a:prstGeom prst="rect">
+                      <a:avLst/>
+                    </a:prstGeom>
+                  </pic:spPr>
+                </pic:pic>
+              </a:graphicData>
+            </a:graphic>
+          </wp:inline>
+        </w:drawing>
+      </w:r>
+    </w:p>
+    <w:p>
+      <w:pPr>
+        <w:rPr>
+          <w:rFonts w:ascii="Arial" w:hAnsi="Arial"/>
+          <w:sz w:val="28"/>
+          <w:szCs w:val="28"/>
+        </w:rPr>
+      </w:pPr>
+      <w:r>
+        <w:rPr>
+          <w:rFonts w:ascii="Arial" w:hAnsi="Arial"/>
+          <w:sz w:val="28"/>
+          <w:szCs w:val="28"/>
+        </w:rPr>
+        <w:t>Alteração dos atributos</w:t>
+      </w:r>
+    </w:p>
+    <w:p>
+      <w:pPr>
+        <w:rPr>
+          <w:rFonts w:ascii="Arial" w:hAnsi="Arial"/>
+          <w:sz w:val="28"/>
+          <w:szCs w:val="28"/>
+        </w:rPr>
+      </w:pPr>
+      <w:r>
+        <w:rPr>
+          <w:rFonts w:ascii="Arial" w:hAnsi="Arial"/>
+          <w:sz w:val="28"/>
+          <w:szCs w:val="28"/>
+        </w:rPr>
+        <w:drawing>
+          <wp:inline distT="0" distB="0" distL="0" distR="0" wp14:anchorId="5C407835" wp14:editId="30507A3F">
+            <wp:extent cx="3953427" cy="4610743"/>
+            <wp:effectExtent l="0" t="0" r="9525" b="0"/>
+            <wp:docPr id="621929977" name="Imagem 1"/>
+            <wp:cNvGraphicFramePr>
+              <a:graphicFrameLocks xmlns:a="http://schemas.openxmlformats.org/drawingml/2006/main" noChangeAspect="1"/>
+            </wp:cNvGraphicFramePr>
+            <a:graphic xmlns:a="http://schemas.openxmlformats.org/drawingml/2006/main">
+              <a:graphicData uri="http://schemas.openxmlformats.org/drawingml/2006/picture">
+                <pic:pic xmlns:pic="http://schemas.openxmlformats.org/drawingml/2006/picture">
+                  <pic:nvPicPr>
+                    <pic:cNvPr id="621929977" name=""/>
+                    <pic:cNvPicPr/>
+                  </pic:nvPicPr>
+                  <pic:blipFill>
+                    <a:blip r:embed="rId11"/>
+                    <a:stretch>
+                      <a:fillRect/>
+                    </a:stretch>
+                  </pic:blipFill>
+                  <pic:spPr>
+                    <a:xfrm>
+                      <a:off x="0" y="0"/>
+                      <a:ext cx="3953427" cy="4610743"/>
+                    </a:xfrm>
+                    <a:prstGeom prst="rect">
+                      <a:avLst/>
+                    </a:prstGeom>
+                  </pic:spPr>
+                </pic:pic>
+              </a:graphicData>
+            </a:graphic>
+          </wp:inline>
+        </w:drawing>
+      </w:r>
+      <w:r>
+        <w:rPr>
+          <w:rFonts w:ascii="Arial" w:hAnsi="Arial"/>
+          <w:sz w:val="28"/>
+          <w:szCs w:val="28"/>
+        </w:rPr>
+        <w:t>Alteração visível</w:t>
+      </w:r>
+    </w:p>
+    <w:p>
+      <w:pPr>
+        <w:rPr>
+          <w:rFonts w:ascii="Arial" w:hAnsi="Arial"/>
+          <w:sz w:val="28"/>
+          <w:szCs w:val="28"/>
+        </w:rPr>
+      </w:pPr>
+    </w:p>
+    <w:p>
+      <w:pPr>
+        <w:rPr>
+          <w:rFonts w:ascii="Arial" w:hAnsi="Arial"/>
+          <w:sz w:val="28"/>
+          <w:szCs w:val="28"/>
+        </w:rPr>
+      </w:pPr>
+    </w:p>
+    <w:p>
+      <w:pPr>
+        <w:rPr>
+          <w:rFonts w:ascii="Arial" w:hAnsi="Arial"/>
+          <w:sz w:val="28"/>
+          <w:szCs w:val="28"/>
+        </w:rPr>
+      </w:pPr>
+    </w:p>
+    <w:p>
+      <w:pPr>
+        <w:rPr>
+          <w:rFonts w:ascii="Arial" w:hAnsi="Arial"/>
+          <w:sz w:val="28"/>
+          <w:szCs w:val="28"/>
+        </w:rPr>
+      </w:pPr>
+    </w:p>
+    <w:p>
+      <w:pPr>
+        <w:rPr>
+          <w:rFonts w:ascii="Arial" w:hAnsi="Arial"/>
+          <w:b/>
+          <w:bCs/>
+          <w:sz w:val="28"/>
+          <w:szCs w:val="28"/>
+        </w:rPr>
+      </w:pPr>
+      <w:r>
+        <w:rPr>
+          <w:rFonts w:ascii="Arial" w:hAnsi="Arial"/>
+          <w:b/>
+          <w:bCs/>
+          <w:sz w:val="28"/>
+          <w:szCs w:val="28"/>
+        </w:rPr>
+        <w:lastRenderedPageBreak/>
+        <w:t>Manipulação de estilos – Antigo</w:t>
+      </w:r>
+    </w:p>
+    <w:p>
+      <w:pPr>
+        <w:rPr>
+          <w:rFonts w:ascii="Arial" w:hAnsi="Arial"/>
+          <w:sz w:val="28"/>
+          <w:szCs w:val="28"/>
+        </w:rPr>
+      </w:pPr>
+      <w:r>
+        <w:rPr>
+          <w:rFonts w:ascii="Arial" w:hAnsi="Arial"/>
+          <w:sz w:val="28"/>
+          <w:szCs w:val="28"/>
+        </w:rPr>
+        <w:t xml:space="preserve">Quando for fazer uma mudança rápida e ÚNICA, </w:t>
+      </w:r>
+      <w:r>
+        <w:rPr>
+          <w:rFonts w:ascii="Arial" w:hAnsi="Arial"/>
+          <w:sz w:val="28"/>
+          <w:szCs w:val="28"/>
+        </w:rPr>
+        <w:t>utilize “</w:t>
+      </w:r>
+      <w:proofErr w:type="spellStart"/>
+      <w:proofErr w:type="gramStart"/>
+      <w:r>
+        <w:rPr>
+          <w:rFonts w:ascii="Arial" w:hAnsi="Arial"/>
+          <w:sz w:val="28"/>
+          <w:szCs w:val="28"/>
+        </w:rPr>
+        <w:t>elemento.style</w:t>
+      </w:r>
+      <w:proofErr w:type="gramEnd"/>
+      <w:r>
+        <w:rPr>
+          <w:rFonts w:ascii="Arial" w:hAnsi="Arial"/>
+          <w:sz w:val="28"/>
+          <w:szCs w:val="28"/>
+        </w:rPr>
+        <w:t>.</w:t>
+      </w:r>
+      <w:r>
+        <w:rPr>
+          <w:rFonts w:ascii="Arial" w:hAnsi="Arial"/>
+          <w:sz w:val="28"/>
+          <w:szCs w:val="28"/>
+        </w:rPr>
+        <w:t>estiloAlterado</w:t>
+      </w:r>
+      <w:proofErr w:type="spellEnd"/>
+      <w:r>
+        <w:rPr>
+          <w:rFonts w:ascii="Arial" w:hAnsi="Arial"/>
+          <w:sz w:val="28"/>
+          <w:szCs w:val="28"/>
+        </w:rPr>
+        <w:t xml:space="preserve">”, com cuidado, pois poluí com estilos </w:t>
+      </w:r>
+      <w:proofErr w:type="spellStart"/>
+      <w:r>
+        <w:rPr>
+          <w:rFonts w:ascii="Arial" w:hAnsi="Arial"/>
+          <w:sz w:val="28"/>
+          <w:szCs w:val="28"/>
+        </w:rPr>
+        <w:t>inline</w:t>
+      </w:r>
+      <w:proofErr w:type="spellEnd"/>
+      <w:r>
+        <w:rPr>
+          <w:rFonts w:ascii="Arial" w:hAnsi="Arial"/>
+          <w:sz w:val="28"/>
+          <w:szCs w:val="28"/>
+        </w:rPr>
+        <w:t>.</w:t>
+      </w:r>
+    </w:p>
+    <w:p>
+      <w:pPr>
+        <w:rPr>
+          <w:rFonts w:ascii="Arial" w:hAnsi="Arial"/>
+          <w:sz w:val="28"/>
+          <w:szCs w:val="28"/>
+        </w:rPr>
+      </w:pPr>
+      <w:r>
+        <w:rPr>
+          <w:rFonts w:ascii="Arial" w:hAnsi="Arial"/>
+          <w:sz w:val="28"/>
+          <w:szCs w:val="28"/>
+        </w:rPr>
+        <w:t>Ex.:</w:t>
+      </w:r>
+    </w:p>
+    <w:p>
+      <w:pPr>
+        <w:rPr>
+          <w:rFonts w:ascii="Arial" w:hAnsi="Arial"/>
+          <w:sz w:val="28"/>
+          <w:szCs w:val="28"/>
+        </w:rPr>
+      </w:pPr>
+      <w:r>
+        <w:rPr>
+          <w:rFonts w:ascii="Arial" w:hAnsi="Arial"/>
+          <w:sz w:val="28"/>
+          <w:szCs w:val="28"/>
+        </w:rPr>
+        <w:drawing>
+          <wp:inline distT="0" distB="0" distL="0" distR="0" wp14:anchorId="6165FB5D" wp14:editId="0EE51D46">
+            <wp:extent cx="5400040" cy="1261745"/>
+            <wp:effectExtent l="0" t="0" r="0" b="0"/>
+            <wp:docPr id="1422122195" name="Imagem 1"/>
+            <wp:cNvGraphicFramePr>
+              <a:graphicFrameLocks xmlns:a="http://schemas.openxmlformats.org/drawingml/2006/main" noChangeAspect="1"/>
+            </wp:cNvGraphicFramePr>
+            <a:graphic xmlns:a="http://schemas.openxmlformats.org/drawingml/2006/main">
+              <a:graphicData uri="http://schemas.openxmlformats.org/drawingml/2006/picture">
+                <pic:pic xmlns:pic="http://schemas.openxmlformats.org/drawingml/2006/picture">
+                  <pic:nvPicPr>
+                    <pic:cNvPr id="1422122195" name=""/>
+                    <pic:cNvPicPr/>
+                  </pic:nvPicPr>
+                  <pic:blipFill>
+                    <a:blip r:embed="rId12"/>
+                    <a:stretch>
+                      <a:fillRect/>
+                    </a:stretch>
+                  </pic:blipFill>
+                  <pic:spPr>
+                    <a:xfrm>
+                      <a:off x="0" y="0"/>
+                      <a:ext cx="5400040" cy="1261745"/>
+                    </a:xfrm>
+                    <a:prstGeom prst="rect">
+                      <a:avLst/>
+                    </a:prstGeom>
+                  </pic:spPr>
+                </pic:pic>
+              </a:graphicData>
+            </a:graphic>
+          </wp:inline>
+        </w:drawing>
+      </w:r>
+    </w:p>
+    <w:p>
+      <w:pPr>
+        <w:rPr>
+          <w:rFonts w:ascii="Arial" w:hAnsi="Arial"/>
+          <w:sz w:val="28"/>
+          <w:szCs w:val="28"/>
+        </w:rPr>
+      </w:pPr>
+      <w:r>
+        <w:rPr>
+          <w:rFonts w:ascii="Arial" w:hAnsi="Arial"/>
+          <w:sz w:val="28"/>
+          <w:szCs w:val="28"/>
+        </w:rPr>
+        <w:drawing>
+          <wp:inline distT="0" distB="0" distL="0" distR="0" wp14:anchorId="744A559E" wp14:editId="62C3859C">
+            <wp:extent cx="4382112" cy="619211"/>
+            <wp:effectExtent l="0" t="0" r="0" b="9525"/>
+            <wp:docPr id="1005172900" name="Imagem 1"/>
+            <wp:cNvGraphicFramePr>
+              <a:graphicFrameLocks xmlns:a="http://schemas.openxmlformats.org/drawingml/2006/main" noChangeAspect="1"/>
+            </wp:cNvGraphicFramePr>
+            <a:graphic xmlns:a="http://schemas.openxmlformats.org/drawingml/2006/main">
+              <a:graphicData uri="http://schemas.openxmlformats.org/drawingml/2006/picture">
+                <pic:pic xmlns:pic="http://schemas.openxmlformats.org/drawingml/2006/picture">
+                  <pic:nvPicPr>
+                    <pic:cNvPr id="1005172900" name=""/>
+                    <pic:cNvPicPr/>
+                  </pic:nvPicPr>
+                  <pic:blipFill>
+                    <a:blip r:embed="rId13"/>
+                    <a:stretch>
+                      <a:fillRect/>
+                    </a:stretch>
+                  </pic:blipFill>
+                  <pic:spPr>
+                    <a:xfrm>
+                      <a:off x="0" y="0"/>
+                      <a:ext cx="4382112" cy="619211"/>
+                    </a:xfrm>
+                    <a:prstGeom prst="rect">
+                      <a:avLst/>
+                    </a:prstGeom>
+                  </pic:spPr>
+                </pic:pic>
+              </a:graphicData>
+            </a:graphic>
+          </wp:inline>
+        </w:drawing>
+      </w:r>
+      <w:r>
+        <w:rPr>
+          <w:rFonts w:ascii="Arial" w:hAnsi="Arial"/>
+          <w:sz w:val="28"/>
+          <w:szCs w:val="28"/>
+        </w:rPr>
+        <w:drawing>
+          <wp:inline distT="0" distB="0" distL="0" distR="0" wp14:anchorId="38F97FC0" wp14:editId="56A6CCDA">
+            <wp:extent cx="3886742" cy="3972479"/>
+            <wp:effectExtent l="0" t="0" r="0" b="9525"/>
+            <wp:docPr id="1337940354" name="Imagem 1"/>
+            <wp:cNvGraphicFramePr>
+              <a:graphicFrameLocks xmlns:a="http://schemas.openxmlformats.org/drawingml/2006/main" noChangeAspect="1"/>
+            </wp:cNvGraphicFramePr>
+            <a:graphic xmlns:a="http://schemas.openxmlformats.org/drawingml/2006/main">
+              <a:graphicData uri="http://schemas.openxmlformats.org/drawingml/2006/picture">
+                <pic:pic xmlns:pic="http://schemas.openxmlformats.org/drawingml/2006/picture">
+                  <pic:nvPicPr>
+                    <pic:cNvPr id="1337940354" name=""/>
+                    <pic:cNvPicPr/>
+                  </pic:nvPicPr>
+                  <pic:blipFill>
+                    <a:blip r:embed="rId14"/>
+                    <a:stretch>
+                      <a:fillRect/>
+                    </a:stretch>
+                  </pic:blipFill>
+                  <pic:spPr>
+                    <a:xfrm>
+                      <a:off x="0" y="0"/>
+                      <a:ext cx="3886742" cy="3972479"/>
+                    </a:xfrm>
+                    <a:prstGeom prst="rect">
+                      <a:avLst/>
+                    </a:prstGeom>
+                  </pic:spPr>
+                </pic:pic>
+              </a:graphicData>
+            </a:graphic>
+          </wp:inline>
+        </w:drawing>
+      </w:r>
+    </w:p>
+    <w:p>
+      <w:pPr>
+        <w:rPr>
+          <w:rFonts w:ascii="Arial" w:hAnsi="Arial"/>
+          <w:sz w:val="28"/>
+          <w:szCs w:val="28"/>
+        </w:rPr>
+      </w:pPr>
+    </w:p>
+    <w:p>
+      <w:pPr>
+        <w:rPr>
+          <w:rFonts w:ascii="Arial" w:hAnsi="Arial"/>
+          <w:sz w:val="28"/>
+          <w:szCs w:val="28"/>
+        </w:rPr>
+      </w:pPr>
+    </w:p>
+    <w:p>
+      <w:pPr>
+        <w:rPr>
+          <w:rFonts w:ascii="Arial" w:hAnsi="Arial"/>
+          <w:sz w:val="28"/>
+          <w:szCs w:val="28"/>
+        </w:rPr>
+      </w:pPr>
+    </w:p>
+    <w:p>
+      <w:pPr>
+        <w:rPr>
+          <w:rFonts w:ascii="Arial" w:hAnsi="Arial"/>
+          <w:sz w:val="28"/>
+          <w:szCs w:val="28"/>
+        </w:rPr>
+      </w:pPr>
+    </w:p>
+    <w:p>
+      <w:pPr>
+        <w:rPr>
+          <w:rFonts w:ascii="Arial" w:hAnsi="Arial"/>
+          <w:b/>
+          <w:bCs/>
+          <w:sz w:val="28"/>
+          <w:szCs w:val="28"/>
+        </w:rPr>
+      </w:pPr>
+      <w:r>
+        <w:rPr>
+          <w:rFonts w:ascii="Arial" w:hAnsi="Arial"/>
+          <w:b/>
+          <w:bCs/>
+          <w:sz w:val="28"/>
+          <w:szCs w:val="28"/>
+        </w:rPr>
+        <w:lastRenderedPageBreak/>
+        <w:t>Manipulação de Estilos – Novo</w:t>
+      </w:r>
+    </w:p>
+    <w:p>
+      <w:pPr>
+        <w:rPr>
+          <w:rFonts w:ascii="Arial" w:hAnsi="Arial"/>
+          <w:sz w:val="28"/>
+          <w:szCs w:val="28"/>
+        </w:rPr>
+      </w:pPr>
+      <w:r>
+        <w:rPr>
+          <w:rFonts w:ascii="Arial" w:hAnsi="Arial"/>
+          <w:sz w:val="28"/>
+          <w:szCs w:val="28"/>
+        </w:rPr>
+        <w:t xml:space="preserve">A prática atual utilizada é o </w:t>
+      </w:r>
+      <w:proofErr w:type="spellStart"/>
+      <w:r>
+        <w:rPr>
+          <w:rFonts w:ascii="Arial" w:hAnsi="Arial"/>
+          <w:b/>
+          <w:bCs/>
+          <w:sz w:val="28"/>
+          <w:szCs w:val="28"/>
+        </w:rPr>
+        <w:t>classList</w:t>
+      </w:r>
+      <w:proofErr w:type="spellEnd"/>
+      <w:r>
+        <w:rPr>
+          <w:rFonts w:ascii="Arial" w:hAnsi="Arial"/>
+          <w:b/>
+          <w:bCs/>
+          <w:sz w:val="28"/>
+          <w:szCs w:val="28"/>
+        </w:rPr>
+        <w:t xml:space="preserve">. </w:t>
+      </w:r>
+      <w:r>
+        <w:rPr>
+          <w:rFonts w:ascii="Arial" w:hAnsi="Arial"/>
+          <w:sz w:val="28"/>
+          <w:szCs w:val="28"/>
+        </w:rPr>
+        <w:t>Você</w:t>
+      </w:r>
+      <w:r>
+        <w:rPr>
+          <w:rFonts w:ascii="Arial" w:hAnsi="Arial"/>
+          <w:sz w:val="28"/>
+          <w:szCs w:val="28"/>
+        </w:rPr>
+        <w:t xml:space="preserve"> cria os estilos no arquivo CSS, e apenas utiliza o </w:t>
+      </w:r>
+      <w:proofErr w:type="spellStart"/>
+      <w:r>
+        <w:rPr>
+          <w:rFonts w:ascii="Arial" w:hAnsi="Arial"/>
+          <w:b/>
+          <w:bCs/>
+          <w:sz w:val="28"/>
+          <w:szCs w:val="28"/>
+        </w:rPr>
+        <w:t>classList</w:t>
+      </w:r>
+      <w:proofErr w:type="spellEnd"/>
+      <w:r>
+        <w:rPr>
+          <w:rFonts w:ascii="Arial" w:hAnsi="Arial"/>
+          <w:sz w:val="28"/>
+          <w:szCs w:val="28"/>
+        </w:rPr>
+        <w:t xml:space="preserve"> para “colar, adicionar” esse elemento</w:t>
+      </w:r>
+      <w:r>
+        <w:rPr>
+          <w:rFonts w:ascii="Arial" w:hAnsi="Arial"/>
+          <w:sz w:val="28"/>
+          <w:szCs w:val="28"/>
+        </w:rPr>
+        <w:t>.</w:t>
+      </w:r>
+    </w:p>
+    <w:p>
+      <w:pPr>
+        <w:rPr>
+          <w:rFonts w:ascii="Arial" w:hAnsi="Arial"/>
+          <w:sz w:val="28"/>
+          <w:szCs w:val="28"/>
+        </w:rPr>
+      </w:pPr>
+      <w:r>
+        <w:rPr>
+          <w:rFonts w:ascii="Arial" w:hAnsi="Arial"/>
+          <w:sz w:val="28"/>
+          <w:szCs w:val="28"/>
+        </w:rPr>
+        <w:drawing>
+          <wp:inline distT="0" distB="0" distL="0" distR="0" wp14:anchorId="5C151688" wp14:editId="300E514C">
+            <wp:extent cx="4210638" cy="866896"/>
+            <wp:effectExtent l="0" t="0" r="0" b="9525"/>
+            <wp:docPr id="1050054804" name="Imagem 1"/>
+            <wp:cNvGraphicFramePr>
+              <a:graphicFrameLocks xmlns:a="http://schemas.openxmlformats.org/drawingml/2006/main" noChangeAspect="1"/>
+            </wp:cNvGraphicFramePr>
+            <a:graphic xmlns:a="http://schemas.openxmlformats.org/drawingml/2006/main">
+              <a:graphicData uri="http://schemas.openxmlformats.org/drawingml/2006/picture">
+                <pic:pic xmlns:pic="http://schemas.openxmlformats.org/drawingml/2006/picture">
+                  <pic:nvPicPr>
+                    <pic:cNvPr id="1050054804" name=""/>
+                    <pic:cNvPicPr/>
+                  </pic:nvPicPr>
+                  <pic:blipFill>
+                    <a:blip r:embed="rId15"/>
+                    <a:stretch>
+                      <a:fillRect/>
+                    </a:stretch>
+                  </pic:blipFill>
+                  <pic:spPr>
+                    <a:xfrm>
+                      <a:off x="0" y="0"/>
+                      <a:ext cx="4210638" cy="866896"/>
+                    </a:xfrm>
+                    <a:prstGeom prst="rect">
+                      <a:avLst/>
+                    </a:prstGeom>
+                  </pic:spPr>
+                </pic:pic>
+              </a:graphicData>
+            </a:graphic>
+          </wp:inline>
+        </w:drawing>
+      </w:r>
+    </w:p>
+    <w:p>
+      <w:pPr>
+        <w:rPr>
+          <w:rFonts w:ascii="Arial" w:hAnsi="Arial"/>
+          <w:b/>
+          <w:bCs/>
+          <w:sz w:val="28"/>
+          <w:szCs w:val="28"/>
+        </w:rPr>
+      </w:pPr>
+      <w:r>
+        <w:rPr>
+          <w:rFonts w:ascii="Arial" w:hAnsi="Arial"/>
+          <w:b/>
+          <w:bCs/>
+          <w:sz w:val="28"/>
+          <w:szCs w:val="28"/>
+        </w:rPr>
+        <w:t>Ex.:</w:t>
+      </w:r>
+    </w:p>
+    <w:p>
+      <w:pPr>
+        <w:rPr>
+          <w:rFonts w:ascii="Arial" w:hAnsi="Arial"/>
+          <w:b/>
+          <w:bCs/>
+          <w:sz w:val="28"/>
+          <w:szCs w:val="28"/>
+        </w:rPr>
+      </w:pPr>
+      <w:r>
+        <w:rPr>
+          <w:rFonts w:ascii="Arial" w:hAnsi="Arial"/>
+          <w:b/>
+          <w:bCs/>
+          <w:sz w:val="28"/>
+          <w:szCs w:val="28"/>
+        </w:rPr>
+        <w:drawing>
+          <wp:inline distT="0" distB="0" distL="0" distR="0" wp14:anchorId="00158A77" wp14:editId="52600BA1">
+            <wp:extent cx="5400040" cy="1031875"/>
+            <wp:effectExtent l="0" t="0" r="0" b="0"/>
+            <wp:docPr id="1021121654" name="Imagem 1"/>
+            <wp:cNvGraphicFramePr>
+              <a:graphicFrameLocks xmlns:a="http://schemas.openxmlformats.org/drawingml/2006/main" noChangeAspect="1"/>
+            </wp:cNvGraphicFramePr>
+            <a:graphic xmlns:a="http://schemas.openxmlformats.org/drawingml/2006/main">
+              <a:graphicData uri="http://schemas.openxmlformats.org/drawingml/2006/picture">
+                <pic:pic xmlns:pic="http://schemas.openxmlformats.org/drawingml/2006/picture">
+                  <pic:nvPicPr>
+                    <pic:cNvPr id="1021121654" name=""/>
+                    <pic:cNvPicPr/>
+                  </pic:nvPicPr>
+                  <pic:blipFill>
+                    <a:blip r:embed="rId16"/>
+                    <a:stretch>
+                      <a:fillRect/>
+                    </a:stretch>
+                  </pic:blipFill>
+                  <pic:spPr>
+                    <a:xfrm>
+                      <a:off x="0" y="0"/>
+                      <a:ext cx="5400040" cy="1031875"/>
+                    </a:xfrm>
+                    <a:prstGeom prst="rect">
+                      <a:avLst/>
+                    </a:prstGeom>
+                  </pic:spPr>
+                </pic:pic>
+              </a:graphicData>
+            </a:graphic>
+          </wp:inline>
+        </w:drawing>
+      </w:r>
+    </w:p>
+    <w:p>
+      <w:pPr>
+        <w:rPr>
+          <w:rFonts w:ascii="Arial" w:hAnsi="Arial"/>
+          <w:b/>
+          <w:bCs/>
+          <w:sz w:val="28"/>
+          <w:szCs w:val="28"/>
+        </w:rPr>
+      </w:pPr>
+      <w:r>
+        <w:rPr>
+          <w:rFonts w:ascii="Arial" w:hAnsi="Arial"/>
+          <w:b/>
+          <w:bCs/>
+          <w:sz w:val="28"/>
+          <w:szCs w:val="28"/>
+        </w:rPr>
+        <w:drawing>
+          <wp:inline distT="0" distB="0" distL="0" distR="0" wp14:anchorId="67955383" wp14:editId="4A0A8BB5">
+            <wp:extent cx="5400040" cy="1081405"/>
+            <wp:effectExtent l="0" t="0" r="0" b="4445"/>
+            <wp:docPr id="1883625578" name="Imagem 1"/>
+            <wp:cNvGraphicFramePr>
+              <a:graphicFrameLocks xmlns:a="http://schemas.openxmlformats.org/drawingml/2006/main" noChangeAspect="1"/>
+            </wp:cNvGraphicFramePr>
+            <a:graphic xmlns:a="http://schemas.openxmlformats.org/drawingml/2006/main">
+              <a:graphicData uri="http://schemas.openxmlformats.org/drawingml/2006/picture">
+                <pic:pic xmlns:pic="http://schemas.openxmlformats.org/drawingml/2006/picture">
+                  <pic:nvPicPr>
+                    <pic:cNvPr id="1883625578" name=""/>
+                    <pic:cNvPicPr/>
+                  </pic:nvPicPr>
+                  <pic:blipFill>
+                    <a:blip r:embed="rId17"/>
+                    <a:stretch>
+                      <a:fillRect/>
+                    </a:stretch>
+                  </pic:blipFill>
+                  <pic:spPr>
+                    <a:xfrm>
+                      <a:off x="0" y="0"/>
+                      <a:ext cx="5400040" cy="1081405"/>
+                    </a:xfrm>
+                    <a:prstGeom prst="rect">
+                      <a:avLst/>
+                    </a:prstGeom>
+                  </pic:spPr>
+                </pic:pic>
+              </a:graphicData>
+            </a:graphic>
+          </wp:inline>
+        </w:drawing>
+      </w:r>
+    </w:p>
+    <w:p>
+      <w:pPr>
+        <w:rPr>
+          <w:rFonts w:ascii="Arial" w:hAnsi="Arial"/>
+          <w:b/>
+          <w:bCs/>
+          <w:sz w:val="28"/>
+          <w:szCs w:val="28"/>
+        </w:rPr>
+      </w:pPr>
+      <w:r>
+        <w:rPr>
+          <w:rFonts w:ascii="Arial" w:hAnsi="Arial"/>
+          <w:b/>
+          <w:bCs/>
+          <w:sz w:val="28"/>
+          <w:szCs w:val="28"/>
+        </w:rPr>
+        <w:drawing>
+          <wp:inline distT="0" distB="0" distL="0" distR="0" wp14:anchorId="0B4BB9DB" wp14:editId="5201F08B">
+            <wp:extent cx="5400040" cy="1740535"/>
+            <wp:effectExtent l="0" t="0" r="0" b="0"/>
+            <wp:docPr id="977026021" name="Imagem 1"/>
+            <wp:cNvGraphicFramePr>
+              <a:graphicFrameLocks xmlns:a="http://schemas.openxmlformats.org/drawingml/2006/main" noChangeAspect="1"/>
+            </wp:cNvGraphicFramePr>
+            <a:graphic xmlns:a="http://schemas.openxmlformats.org/drawingml/2006/main">
+              <a:graphicData uri="http://schemas.openxmlformats.org/drawingml/2006/picture">
+                <pic:pic xmlns:pic="http://schemas.openxmlformats.org/drawingml/2006/picture">
+                  <pic:nvPicPr>
+                    <pic:cNvPr id="977026021" name=""/>
+                    <pic:cNvPicPr/>
+                  </pic:nvPicPr>
+                  <pic:blipFill>
+                    <a:blip r:embed="rId18"/>
+                    <a:stretch>
+                      <a:fillRect/>
+                    </a:stretch>
+                  </pic:blipFill>
+                  <pic:spPr>
+                    <a:xfrm>
+                      <a:off x="0" y="0"/>
+                      <a:ext cx="5400040" cy="1740535"/>
+                    </a:xfrm>
+                    <a:prstGeom prst="rect">
+                      <a:avLst/>
+                    </a:prstGeom>
+                  </pic:spPr>
+                </pic:pic>
+              </a:graphicData>
+            </a:graphic>
+          </wp:inline>
+        </w:drawing>
+      </w:r>
+    </w:p>
+    <w:p>
+      <w:pPr>
+        <w:rPr>
+          <w:rFonts w:ascii="Arial" w:hAnsi="Arial"/>
+          <w:b/>
+          <w:bCs/>
+          <w:sz w:val="28"/>
+          <w:szCs w:val="28"/>
+        </w:rPr>
+      </w:pPr>
+    </w:p>
+    <w:p>
+      <w:pPr>
+        <w:rPr>
+          <w:rFonts w:ascii="Arial" w:hAnsi="Arial"/>
+          <w:b/>
+          <w:bCs/>
+          <w:sz w:val="28"/>
+          <w:szCs w:val="28"/>
+        </w:rPr>
+      </w:pPr>
+      <w:r>
+        <w:rPr>
+          <w:rFonts w:ascii="Arial" w:hAnsi="Arial"/>
+          <w:b/>
+          <w:bCs/>
+          <w:sz w:val="28"/>
+          <w:szCs w:val="28"/>
+        </w:rPr>
+        <w:t>.</w:t>
+      </w:r>
+      <w:proofErr w:type="spellStart"/>
+      <w:proofErr w:type="gramStart"/>
+      <w:r>
+        <w:rPr>
+          <w:rFonts w:ascii="Arial" w:hAnsi="Arial"/>
+          <w:b/>
+          <w:bCs/>
+          <w:sz w:val="28"/>
+          <w:szCs w:val="28"/>
+        </w:rPr>
+        <w:t>value</w:t>
+      </w:r>
+      <w:proofErr w:type="spellEnd"/>
+      <w:r>
+        <w:rPr>
+          <w:rFonts w:ascii="Arial" w:hAnsi="Arial"/>
+          <w:b/>
+          <w:bCs/>
+          <w:sz w:val="28"/>
+          <w:szCs w:val="28"/>
+        </w:rPr>
+        <w:t>(</w:t>
+      </w:r>
+      <w:proofErr w:type="gramEnd"/>
+      <w:r>
+        <w:rPr>
+          <w:rFonts w:ascii="Arial" w:hAnsi="Arial"/>
+          <w:b/>
+          <w:bCs/>
+          <w:sz w:val="28"/>
+          <w:szCs w:val="28"/>
+        </w:rPr>
+        <w:t>)</w:t>
+      </w:r>
+      <w:r>
+        <w:rPr>
+          <w:rFonts w:ascii="Arial" w:hAnsi="Arial"/>
+          <w:b/>
+          <w:bCs/>
+          <w:sz w:val="28"/>
+          <w:szCs w:val="28"/>
+        </w:rPr>
+        <w:t xml:space="preserve"> – Captura de Dados</w:t>
+      </w:r>
+    </w:p>
+    <w:p>
+      <w:pPr>
+        <w:rPr>
+          <w:rFonts w:ascii="Arial" w:hAnsi="Arial"/>
+          <w:b/>
+          <w:bCs/>
+          <w:sz w:val="28"/>
+          <w:szCs w:val="28"/>
+        </w:rPr>
+      </w:pPr>
+      <w:proofErr w:type="spellStart"/>
+      <w:proofErr w:type="gramStart"/>
+      <w:r>
+        <w:rPr>
+          <w:rFonts w:ascii="Arial" w:hAnsi="Arial"/>
+          <w:b/>
+          <w:bCs/>
+          <w:sz w:val="28"/>
+          <w:szCs w:val="28"/>
+        </w:rPr>
+        <w:t>Number</w:t>
+      </w:r>
+      <w:proofErr w:type="spellEnd"/>
+      <w:r>
+        <w:rPr>
+          <w:rFonts w:ascii="Arial" w:hAnsi="Arial"/>
+          <w:b/>
+          <w:bCs/>
+          <w:sz w:val="28"/>
+          <w:szCs w:val="28"/>
+        </w:rPr>
+        <w:t>(</w:t>
+      </w:r>
+      <w:proofErr w:type="gramEnd"/>
+      <w:r>
+        <w:rPr>
+          <w:rFonts w:ascii="Arial" w:hAnsi="Arial"/>
+          <w:b/>
+          <w:bCs/>
+          <w:sz w:val="28"/>
+          <w:szCs w:val="28"/>
+        </w:rPr>
+        <w:t>) – Conversão de Dados para número</w:t>
+      </w:r>
+    </w:p>
+    <w:p>
+      <w:pPr>
+        <w:rPr>
+          <w:rFonts w:ascii="Arial" w:hAnsi="Arial"/>
+          <w:b/>
+          <w:bCs/>
+          <w:sz w:val="28"/>
+          <w:szCs w:val="28"/>
+        </w:rPr>
+      </w:pPr>
+    </w:p>
+    <w:p>
+      <w:pPr>
+        <w:rPr>
+          <w:rFonts w:ascii="Arial" w:hAnsi="Arial"/>
+          <w:b/>
+          <w:bCs/>
+          <w:sz w:val="28"/>
+          <w:szCs w:val="28"/>
+        </w:rPr>
+      </w:pPr>
     </w:p>
     <w:p>
       <w:pPr>

</xml_diff>

<commit_message>
Aula 0903 - FRONT - Atividades aula 05 e 06 - Exercicio EcoCycle aula 06
</commit_message>
<xml_diff>
--- a/SENAI/WORDS/3º SEMESTRE/Front-end/aula05_dom.docx
+++ b/SENAI/WORDS/3º SEMESTRE/Front-end/aula05_dom.docx
@@ -133,43 +133,7 @@
           <w:sz w:val="28"/>
           <w:szCs w:val="28"/>
         </w:rPr>
-        <w:t xml:space="preserve">DOM significa </w:t>
-      </w:r>
-      <w:proofErr w:type="spellStart"/>
-      <w:r>
-        <w:rPr>
-          <w:rFonts w:ascii="Arial" w:hAnsi="Arial"/>
-          <w:sz w:val="28"/>
-          <w:szCs w:val="28"/>
-        </w:rPr>
-        <w:t>Document</w:t>
-      </w:r>
-      <w:proofErr w:type="spellEnd"/>
-      <w:r>
-        <w:rPr>
-          <w:rFonts w:ascii="Arial" w:hAnsi="Arial"/>
-          <w:sz w:val="28"/>
-          <w:szCs w:val="28"/>
-        </w:rPr>
-        <w:t xml:space="preserve"> </w:t>
-      </w:r>
-      <w:proofErr w:type="spellStart"/>
-      <w:r>
-        <w:rPr>
-          <w:rFonts w:ascii="Arial" w:hAnsi="Arial"/>
-          <w:sz w:val="28"/>
-          <w:szCs w:val="28"/>
-        </w:rPr>
-        <w:t>Object</w:t>
-      </w:r>
-      <w:proofErr w:type="spellEnd"/>
-      <w:r>
-        <w:rPr>
-          <w:rFonts w:ascii="Arial" w:hAnsi="Arial"/>
-          <w:sz w:val="28"/>
-          <w:szCs w:val="28"/>
-        </w:rPr>
-        <w:t xml:space="preserve"> Model,</w:t>
+        <w:t>DOM significa Document Object Model,</w:t>
       </w:r>
       <w:r>
         <w:rPr>
@@ -197,27 +161,15 @@
         </w:rPr>
         <w:t xml:space="preserve">. Antes precisamos entender a manipulação de um site. Temos o </w:t>
       </w:r>
-      <w:proofErr w:type="spellStart"/>
-      <w:r>
-        <w:rPr>
-          <w:rFonts w:ascii="Arial" w:hAnsi="Arial"/>
-          <w:b/>
-          <w:bCs/>
-          <w:sz w:val="28"/>
-          <w:szCs w:val="28"/>
-        </w:rPr>
-        <w:t>window</w:t>
-      </w:r>
-      <w:proofErr w:type="spellEnd"/>
-      <w:r>
-        <w:rPr>
-          <w:rFonts w:ascii="Arial" w:hAnsi="Arial"/>
-          <w:b/>
-          <w:bCs/>
-          <w:sz w:val="28"/>
-          <w:szCs w:val="28"/>
-        </w:rPr>
-        <w:t xml:space="preserve"> </w:t>
+      <w:r>
+        <w:rPr>
+          <w:rFonts w:ascii="Arial" w:hAnsi="Arial"/>
+          <w:b/>
+          <w:bCs/>
+          <w:sz w:val="28"/>
+          <w:szCs w:val="28"/>
+        </w:rPr>
+        <w:t xml:space="preserve">window </w:t>
       </w:r>
       <w:r>
         <w:rPr>
@@ -227,7 +179,6 @@
         </w:rPr>
         <w:t xml:space="preserve">e o </w:t>
       </w:r>
-      <w:proofErr w:type="spellStart"/>
       <w:r>
         <w:rPr>
           <w:rFonts w:ascii="Arial" w:hAnsi="Arial"/>
@@ -238,7 +189,6 @@
         </w:rPr>
         <w:t>document</w:t>
       </w:r>
-      <w:proofErr w:type="spellEnd"/>
     </w:p>
     <w:p>
       <w:pPr>
@@ -253,27 +203,15 @@
           <w:szCs w:val="28"/>
         </w:rPr>
       </w:pPr>
-      <w:proofErr w:type="spellStart"/>
-      <w:r>
-        <w:rPr>
-          <w:rFonts w:ascii="Arial" w:hAnsi="Arial"/>
-          <w:b/>
-          <w:bCs/>
-          <w:sz w:val="28"/>
-          <w:szCs w:val="28"/>
-        </w:rPr>
-        <w:t>window</w:t>
-      </w:r>
-      <w:proofErr w:type="spellEnd"/>
-      <w:r>
-        <w:rPr>
-          <w:rFonts w:ascii="Arial" w:hAnsi="Arial"/>
-          <w:b/>
-          <w:bCs/>
-          <w:sz w:val="28"/>
-          <w:szCs w:val="28"/>
-        </w:rPr>
-        <w:t xml:space="preserve">: </w:t>
+      <w:r>
+        <w:rPr>
+          <w:rFonts w:ascii="Arial" w:hAnsi="Arial"/>
+          <w:b/>
+          <w:bCs/>
+          <w:sz w:val="28"/>
+          <w:szCs w:val="28"/>
+        </w:rPr>
+        <w:t xml:space="preserve">window: </w:t>
       </w:r>
       <w:r>
         <w:rPr>
@@ -289,35 +227,7 @@
           <w:sz w:val="28"/>
           <w:szCs w:val="28"/>
         </w:rPr>
-        <w:t xml:space="preserve">, nele podemos utilizar comandos como </w:t>
-      </w:r>
-      <w:proofErr w:type="spellStart"/>
-      <w:proofErr w:type="gramStart"/>
-      <w:r>
-        <w:rPr>
-          <w:rFonts w:ascii="Arial" w:hAnsi="Arial"/>
-          <w:sz w:val="28"/>
-          <w:szCs w:val="28"/>
-        </w:rPr>
-        <w:t>alert</w:t>
-      </w:r>
-      <w:proofErr w:type="spellEnd"/>
-      <w:r>
-        <w:rPr>
-          <w:rFonts w:ascii="Arial" w:hAnsi="Arial"/>
-          <w:sz w:val="28"/>
-          <w:szCs w:val="28"/>
-        </w:rPr>
-        <w:t>(</w:t>
-      </w:r>
-      <w:proofErr w:type="gramEnd"/>
-      <w:r>
-        <w:rPr>
-          <w:rFonts w:ascii="Arial" w:hAnsi="Arial"/>
-          <w:sz w:val="28"/>
-          <w:szCs w:val="28"/>
-        </w:rPr>
-        <w:t>)</w:t>
+        <w:t>, nele podemos utilizar comandos como alert()</w:t>
       </w:r>
     </w:p>
     <w:p>
@@ -333,27 +243,15 @@
           <w:szCs w:val="28"/>
         </w:rPr>
       </w:pPr>
-      <w:proofErr w:type="spellStart"/>
-      <w:r>
-        <w:rPr>
-          <w:rFonts w:ascii="Arial" w:hAnsi="Arial"/>
-          <w:b/>
-          <w:bCs/>
-          <w:sz w:val="28"/>
-          <w:szCs w:val="28"/>
-        </w:rPr>
-        <w:t>document</w:t>
-      </w:r>
-      <w:proofErr w:type="spellEnd"/>
-      <w:r>
-        <w:rPr>
-          <w:rFonts w:ascii="Arial" w:hAnsi="Arial"/>
-          <w:b/>
-          <w:bCs/>
-          <w:sz w:val="28"/>
-          <w:szCs w:val="28"/>
-        </w:rPr>
-        <w:t xml:space="preserve">: </w:t>
+      <w:r>
+        <w:rPr>
+          <w:rFonts w:ascii="Arial" w:hAnsi="Arial"/>
+          <w:b/>
+          <w:bCs/>
+          <w:sz w:val="28"/>
+          <w:szCs w:val="28"/>
+        </w:rPr>
+        <w:t xml:space="preserve">document: </w:t>
       </w:r>
       <w:r>
         <w:rPr>
@@ -369,25 +267,7 @@
           <w:sz w:val="28"/>
           <w:szCs w:val="28"/>
         </w:rPr>
-        <w:t xml:space="preserve">a página, o HTML, onde ficam as </w:t>
-      </w:r>
-      <w:proofErr w:type="spellStart"/>
-      <w:r>
-        <w:rPr>
-          <w:rFonts w:ascii="Arial" w:hAnsi="Arial"/>
-          <w:sz w:val="28"/>
-          <w:szCs w:val="28"/>
-        </w:rPr>
-        <w:t>tags</w:t>
-      </w:r>
-      <w:proofErr w:type="spellEnd"/>
-      <w:r>
-        <w:rPr>
-          <w:rFonts w:ascii="Arial" w:hAnsi="Arial"/>
-          <w:sz w:val="28"/>
-          <w:szCs w:val="28"/>
-        </w:rPr>
-        <w:t>, o conteúdo do site.</w:t>
+        <w:t>a página, o HTML, onde ficam as tags, o conteúdo do site.</w:t>
       </w:r>
     </w:p>
     <w:p>
@@ -440,27 +320,15 @@
           <w:szCs w:val="28"/>
         </w:rPr>
       </w:pPr>
-      <w:proofErr w:type="spellStart"/>
-      <w:r>
-        <w:rPr>
-          <w:rFonts w:ascii="Arial" w:hAnsi="Arial"/>
-          <w:b/>
-          <w:bCs/>
-          <w:sz w:val="28"/>
-          <w:szCs w:val="28"/>
-        </w:rPr>
-        <w:t>Document</w:t>
-      </w:r>
-      <w:proofErr w:type="spellEnd"/>
-      <w:r>
-        <w:rPr>
-          <w:rFonts w:ascii="Arial" w:hAnsi="Arial"/>
-          <w:b/>
-          <w:bCs/>
-          <w:sz w:val="28"/>
-          <w:szCs w:val="28"/>
-        </w:rPr>
-        <w:t xml:space="preserve">: </w:t>
+      <w:r>
+        <w:rPr>
+          <w:rFonts w:ascii="Arial" w:hAnsi="Arial"/>
+          <w:b/>
+          <w:bCs/>
+          <w:sz w:val="28"/>
+          <w:szCs w:val="28"/>
+        </w:rPr>
+        <w:t xml:space="preserve">Document: </w:t>
       </w:r>
       <w:r>
         <w:rPr>
@@ -486,72 +354,32 @@
           <w:szCs w:val="28"/>
         </w:rPr>
       </w:pPr>
-      <w:proofErr w:type="spellStart"/>
-      <w:r>
-        <w:rPr>
-          <w:rFonts w:ascii="Arial" w:hAnsi="Arial"/>
-          <w:b/>
-          <w:bCs/>
-          <w:sz w:val="28"/>
-          <w:szCs w:val="28"/>
-        </w:rPr>
-        <w:t>Object</w:t>
-      </w:r>
-      <w:proofErr w:type="spellEnd"/>
-      <w:r>
-        <w:rPr>
-          <w:rFonts w:ascii="Arial" w:hAnsi="Arial"/>
-          <w:b/>
-          <w:bCs/>
-          <w:sz w:val="28"/>
-          <w:szCs w:val="28"/>
-        </w:rPr>
-        <w:t>:</w:t>
-      </w:r>
-      <w:r>
-        <w:rPr>
-          <w:rFonts w:ascii="Arial" w:hAnsi="Arial"/>
-          <w:sz w:val="28"/>
-          <w:szCs w:val="28"/>
-        </w:rPr>
-        <w:t xml:space="preserve"> As </w:t>
-      </w:r>
-      <w:proofErr w:type="spellStart"/>
-      <w:r>
-        <w:rPr>
-          <w:rFonts w:ascii="Arial" w:hAnsi="Arial"/>
-          <w:sz w:val="28"/>
-          <w:szCs w:val="28"/>
-        </w:rPr>
-        <w:t>tags</w:t>
-      </w:r>
-      <w:proofErr w:type="spellEnd"/>
-      <w:r>
-        <w:rPr>
-          <w:rFonts w:ascii="Arial" w:hAnsi="Arial"/>
-          <w:sz w:val="28"/>
-          <w:szCs w:val="28"/>
-        </w:rPr>
-        <w:t xml:space="preserve"> do HTML</w:t>
-      </w:r>
-      <w:r>
-        <w:rPr>
-          <w:rFonts w:ascii="Arial" w:hAnsi="Arial"/>
-          <w:sz w:val="28"/>
-          <w:szCs w:val="28"/>
-        </w:rPr>
-        <w:t xml:space="preserve">, viram objeto dentro do </w:t>
-      </w:r>
-      <w:proofErr w:type="spellStart"/>
-      <w:r>
-        <w:rPr>
-          <w:rFonts w:ascii="Arial" w:hAnsi="Arial"/>
-          <w:sz w:val="28"/>
-          <w:szCs w:val="28"/>
-        </w:rPr>
-        <w:t>JavaScript</w:t>
-      </w:r>
-      <w:proofErr w:type="spellEnd"/>
+      <w:r>
+        <w:rPr>
+          <w:rFonts w:ascii="Arial" w:hAnsi="Arial"/>
+          <w:b/>
+          <w:bCs/>
+          <w:sz w:val="28"/>
+          <w:szCs w:val="28"/>
+        </w:rPr>
+        <w:t>Object:</w:t>
+      </w:r>
+      <w:r>
+        <w:rPr>
+          <w:rFonts w:ascii="Arial" w:hAnsi="Arial"/>
+          <w:sz w:val="28"/>
+          <w:szCs w:val="28"/>
+        </w:rPr>
+        <w:t xml:space="preserve"> As tags do HTML</w:t>
+      </w:r>
+      <w:r>
+        <w:rPr>
+          <w:rFonts w:ascii="Arial" w:hAnsi="Arial"/>
+          <w:sz w:val="28"/>
+          <w:szCs w:val="28"/>
+        </w:rPr>
+        <w:t>, viram objeto dentro do JavaScript</w:t>
+      </w:r>
     </w:p>
     <w:p>
       <w:pPr>
@@ -796,73 +624,7 @@
           <w:szCs w:val="28"/>
         </w:rPr>
         <w:lastRenderedPageBreak/>
-        <w:t xml:space="preserve">Exemplos no </w:t>
-      </w:r>
-      <w:proofErr w:type="spellStart"/>
-      <w:r>
-        <w:rPr>
-          <w:rFonts w:ascii="Arial" w:hAnsi="Arial"/>
-          <w:b/>
-          <w:bCs/>
-          <w:sz w:val="28"/>
-          <w:szCs w:val="28"/>
-        </w:rPr>
-        <w:t>VSCode</w:t>
-      </w:r>
-      <w:proofErr w:type="spellEnd"/>
-      <w:r>
-        <w:rPr>
-          <w:rFonts w:ascii="Arial" w:hAnsi="Arial"/>
-          <w:b/>
-          <w:bCs/>
-          <w:sz w:val="28"/>
-          <w:szCs w:val="28"/>
-        </w:rPr>
-        <w:t xml:space="preserve"> – Aula 05 – </w:t>
-      </w:r>
-      <w:proofErr w:type="spellStart"/>
-      <w:r>
-        <w:rPr>
-          <w:rFonts w:ascii="Arial" w:hAnsi="Arial"/>
-          <w:b/>
-          <w:bCs/>
-          <w:sz w:val="28"/>
-          <w:szCs w:val="28"/>
-        </w:rPr>
-        <w:t>codigosantigos</w:t>
-      </w:r>
-      <w:proofErr w:type="spellEnd"/>
-      <w:r>
-        <w:rPr>
-          <w:rFonts w:ascii="Arial" w:hAnsi="Arial"/>
-          <w:b/>
-          <w:bCs/>
-          <w:sz w:val="28"/>
-          <w:szCs w:val="28"/>
-        </w:rPr>
-        <w:t xml:space="preserve"> e </w:t>
-      </w:r>
-      <w:proofErr w:type="spellStart"/>
-      <w:r>
-        <w:rPr>
-          <w:rFonts w:ascii="Arial" w:hAnsi="Arial"/>
-          <w:b/>
-          <w:bCs/>
-          <w:sz w:val="28"/>
-          <w:szCs w:val="28"/>
-        </w:rPr>
-        <w:t>codigosnovos</w:t>
-      </w:r>
-      <w:proofErr w:type="spellEnd"/>
-      <w:r>
-        <w:rPr>
-          <w:rFonts w:ascii="Arial" w:hAnsi="Arial"/>
-          <w:b/>
-          <w:bCs/>
-          <w:sz w:val="28"/>
-          <w:szCs w:val="28"/>
-        </w:rPr>
-        <w:t>:</w:t>
+        <w:t>Exemplos no VSCode – Aula 05 – codigosantigos e codigosnovos:</w:t>
       </w:r>
     </w:p>
     <w:p>
@@ -983,8 +745,6 @@
           <w:szCs w:val="28"/>
         </w:rPr>
       </w:pPr>
-      <w:proofErr w:type="spellStart"/>
-      <w:proofErr w:type="gramStart"/>
       <w:r>
         <w:rPr>
           <w:rFonts w:ascii="Arial" w:hAnsi="Arial"/>
@@ -1009,8 +769,6 @@
         </w:rPr>
         <w:t>ElementById</w:t>
       </w:r>
-      <w:proofErr w:type="spellEnd"/>
-      <w:proofErr w:type="gramEnd"/>
       <w:r>
         <w:rPr>
           <w:rFonts w:ascii="Arial" w:hAnsi="Arial"/>
@@ -1052,8 +810,6 @@
           <w:szCs w:val="28"/>
         </w:rPr>
       </w:pPr>
-      <w:proofErr w:type="spellStart"/>
-      <w:proofErr w:type="gramStart"/>
       <w:r>
         <w:rPr>
           <w:rFonts w:ascii="Arial" w:hAnsi="Arial"/>
@@ -1062,8 +818,6 @@
         </w:rPr>
         <w:t>document.getElementsByClass</w:t>
       </w:r>
-      <w:proofErr w:type="spellEnd"/>
-      <w:proofErr w:type="gramEnd"/>
       <w:r>
         <w:rPr>
           <w:rFonts w:ascii="Arial" w:hAnsi="Arial"/>
@@ -1113,8 +867,6 @@
           <w:szCs w:val="28"/>
         </w:rPr>
       </w:pPr>
-      <w:proofErr w:type="spellStart"/>
-      <w:proofErr w:type="gramStart"/>
       <w:r>
         <w:rPr>
           <w:rFonts w:ascii="Arial" w:hAnsi="Arial"/>
@@ -1131,8 +883,6 @@
         </w:rPr>
         <w:t>tsByTag</w:t>
       </w:r>
-      <w:proofErr w:type="spellEnd"/>
-      <w:proofErr w:type="gramEnd"/>
       <w:r>
         <w:rPr>
           <w:rFonts w:ascii="Arial" w:hAnsi="Arial"/>
@@ -1181,23 +931,13 @@
         </w:rPr>
         <w:t xml:space="preserve"> </w:t>
       </w:r>
-      <w:proofErr w:type="spellStart"/>
-      <w:r>
-        <w:rPr>
-          <w:rFonts w:ascii="Arial" w:hAnsi="Arial"/>
-          <w:sz w:val="28"/>
-          <w:szCs w:val="28"/>
-        </w:rPr>
-        <w:t>tag</w:t>
-      </w:r>
-      <w:proofErr w:type="spellEnd"/>
-      <w:r>
-        <w:rPr>
-          <w:rFonts w:ascii="Arial" w:hAnsi="Arial"/>
-          <w:sz w:val="28"/>
-          <w:szCs w:val="28"/>
-        </w:rPr>
-        <w:t xml:space="preserve"> HTML (trata como lista)</w:t>
+      <w:r>
+        <w:rPr>
+          <w:rFonts w:ascii="Arial" w:hAnsi="Arial"/>
+          <w:sz w:val="28"/>
+          <w:szCs w:val="28"/>
+        </w:rPr>
+        <w:t>tag HTML (trata como lista)</w:t>
       </w:r>
     </w:p>
     <w:p>
@@ -1238,8 +978,6 @@
           <w:szCs w:val="28"/>
         </w:rPr>
       </w:pPr>
-      <w:proofErr w:type="spellStart"/>
-      <w:proofErr w:type="gramStart"/>
       <w:r>
         <w:rPr>
           <w:rFonts w:ascii="Arial" w:hAnsi="Arial"/>
@@ -1254,17 +992,7 @@
           <w:sz w:val="28"/>
           <w:szCs w:val="28"/>
         </w:rPr>
-        <w:t>querySelector</w:t>
-      </w:r>
-      <w:proofErr w:type="spellEnd"/>
-      <w:proofErr w:type="gramEnd"/>
-      <w:r>
-        <w:rPr>
-          <w:rFonts w:ascii="Arial" w:hAnsi="Arial"/>
-          <w:sz w:val="28"/>
-          <w:szCs w:val="28"/>
-        </w:rPr>
-        <w:t>(</w:t>
+        <w:t>querySelector(</w:t>
       </w:r>
       <w:r>
         <w:rPr>
@@ -1288,43 +1016,7 @@
           <w:sz w:val="28"/>
           <w:szCs w:val="28"/>
         </w:rPr>
-        <w:t xml:space="preserve"> se for classe: </w:t>
-      </w:r>
-      <w:proofErr w:type="gramStart"/>
-      <w:r>
-        <w:rPr>
-          <w:rFonts w:ascii="Arial" w:hAnsi="Arial"/>
-          <w:sz w:val="28"/>
-          <w:szCs w:val="28"/>
-        </w:rPr>
-        <w:t>“.nome</w:t>
-      </w:r>
-      <w:proofErr w:type="gramEnd"/>
-      <w:r>
-        <w:rPr>
-          <w:rFonts w:ascii="Arial" w:hAnsi="Arial"/>
-          <w:sz w:val="28"/>
-          <w:szCs w:val="28"/>
-        </w:rPr>
-        <w:t xml:space="preserve">”, id: “#nome”, </w:t>
-      </w:r>
-      <w:proofErr w:type="spellStart"/>
-      <w:r>
-        <w:rPr>
-          <w:rFonts w:ascii="Arial" w:hAnsi="Arial"/>
-          <w:sz w:val="28"/>
-          <w:szCs w:val="28"/>
-        </w:rPr>
-        <w:t>tag</w:t>
-      </w:r>
-      <w:proofErr w:type="spellEnd"/>
-      <w:r>
-        <w:rPr>
-          <w:rFonts w:ascii="Arial" w:hAnsi="Arial"/>
-          <w:sz w:val="28"/>
-          <w:szCs w:val="28"/>
-        </w:rPr>
-        <w:t>: &lt;nome&gt;</w:t>
+        <w:t xml:space="preserve"> se for classe: “.nome”, id: “#nome”, tag: &lt;nome&gt;</w:t>
       </w:r>
       <w:r>
         <w:rPr>
@@ -1373,113 +1065,39 @@
           <w:szCs w:val="28"/>
         </w:rPr>
       </w:pPr>
-      <w:proofErr w:type="spellStart"/>
-      <w:r>
-        <w:rPr>
-          <w:rFonts w:ascii="Arial" w:hAnsi="Arial"/>
-          <w:sz w:val="28"/>
-          <w:szCs w:val="28"/>
-        </w:rPr>
-        <w:t>textContent</w:t>
-      </w:r>
-      <w:proofErr w:type="spellEnd"/>
-      <w:r>
-        <w:rPr>
-          <w:rFonts w:ascii="Arial" w:hAnsi="Arial"/>
-          <w:sz w:val="28"/>
-          <w:szCs w:val="28"/>
-        </w:rPr>
-        <w:t>: Altera apenas o texto puro. É mais performático e seguro, pois o navegador não tenta "entender" o que você escreveu como código.</w:t>
-      </w:r>
-    </w:p>
-    <w:p>
-      <w:pPr>
-        <w:rPr>
-          <w:rFonts w:ascii="Arial" w:hAnsi="Arial"/>
-          <w:sz w:val="28"/>
-          <w:szCs w:val="28"/>
-        </w:rPr>
-      </w:pPr>
-    </w:p>
-    <w:p>
-      <w:pPr>
-        <w:rPr>
-          <w:rFonts w:ascii="Arial" w:hAnsi="Arial"/>
-          <w:sz w:val="28"/>
-          <w:szCs w:val="28"/>
-        </w:rPr>
-      </w:pPr>
-      <w:proofErr w:type="spellStart"/>
-      <w:r>
-        <w:rPr>
-          <w:rFonts w:ascii="Arial" w:hAnsi="Arial"/>
-          <w:sz w:val="28"/>
-          <w:szCs w:val="28"/>
-        </w:rPr>
-        <w:t>innerHTML</w:t>
-      </w:r>
-      <w:proofErr w:type="spellEnd"/>
-      <w:r>
-        <w:rPr>
-          <w:rFonts w:ascii="Arial" w:hAnsi="Arial"/>
-          <w:sz w:val="28"/>
-          <w:szCs w:val="28"/>
-        </w:rPr>
-        <w:t xml:space="preserve">: Altera o conteúdo permitindo o uso de </w:t>
-      </w:r>
-      <w:proofErr w:type="spellStart"/>
-      <w:r>
-        <w:rPr>
-          <w:rFonts w:ascii="Arial" w:hAnsi="Arial"/>
-          <w:sz w:val="28"/>
-          <w:szCs w:val="28"/>
-        </w:rPr>
-        <w:t>tags</w:t>
-      </w:r>
-      <w:proofErr w:type="spellEnd"/>
-      <w:r>
-        <w:rPr>
-          <w:rFonts w:ascii="Arial" w:hAnsi="Arial"/>
-          <w:sz w:val="28"/>
-          <w:szCs w:val="28"/>
-        </w:rPr>
-        <w:t xml:space="preserve"> HTML. Se você escrever: &lt;</w:t>
-      </w:r>
-      <w:proofErr w:type="spellStart"/>
-      <w:r>
-        <w:rPr>
-          <w:rFonts w:ascii="Arial" w:hAnsi="Arial"/>
-          <w:sz w:val="28"/>
-          <w:szCs w:val="28"/>
-        </w:rPr>
-        <w:t>strong</w:t>
-      </w:r>
-      <w:proofErr w:type="spellEnd"/>
-      <w:r>
-        <w:rPr>
-          <w:rFonts w:ascii="Arial" w:hAnsi="Arial"/>
-          <w:sz w:val="28"/>
-          <w:szCs w:val="28"/>
-        </w:rPr>
-        <w:t>&gt;Ok&lt;/</w:t>
-      </w:r>
-      <w:proofErr w:type="spellStart"/>
-      <w:r>
-        <w:rPr>
-          <w:rFonts w:ascii="Arial" w:hAnsi="Arial"/>
-          <w:sz w:val="28"/>
-          <w:szCs w:val="28"/>
-        </w:rPr>
-        <w:t>strong</w:t>
-      </w:r>
-      <w:proofErr w:type="spellEnd"/>
-      <w:r>
-        <w:rPr>
-          <w:rFonts w:ascii="Arial" w:hAnsi="Arial"/>
-          <w:sz w:val="28"/>
-          <w:szCs w:val="28"/>
-        </w:rPr>
-        <w:t>&gt;, ele deixará a palavra em negrito.</w:t>
+      <w:r>
+        <w:rPr>
+          <w:rFonts w:ascii="Arial" w:hAnsi="Arial"/>
+          <w:sz w:val="28"/>
+          <w:szCs w:val="28"/>
+        </w:rPr>
+        <w:t>textContent: Altera apenas o texto puro. É mais performático e seguro, pois o navegador não tenta "entender" o que você escreveu como código.</w:t>
+      </w:r>
+    </w:p>
+    <w:p>
+      <w:pPr>
+        <w:rPr>
+          <w:rFonts w:ascii="Arial" w:hAnsi="Arial"/>
+          <w:sz w:val="28"/>
+          <w:szCs w:val="28"/>
+        </w:rPr>
+      </w:pPr>
+    </w:p>
+    <w:p>
+      <w:pPr>
+        <w:rPr>
+          <w:rFonts w:ascii="Arial" w:hAnsi="Arial"/>
+          <w:sz w:val="28"/>
+          <w:szCs w:val="28"/>
+        </w:rPr>
+      </w:pPr>
+      <w:r>
+        <w:rPr>
+          <w:rFonts w:ascii="Arial" w:hAnsi="Arial"/>
+          <w:sz w:val="28"/>
+          <w:szCs w:val="28"/>
+        </w:rPr>
+        <w:t>innerHTML: Altera o conteúdo permitindo o uso de tags HTML. Se você escrever: &lt;strong&gt;Ok&lt;/strong&gt;, ele deixará a palavra em negrito.</w:t>
       </w:r>
     </w:p>
     <w:p>
@@ -1528,7 +1146,6 @@
         </w:rPr>
         <w:t xml:space="preserve">Utilizar </w:t>
       </w:r>
-      <w:proofErr w:type="spellStart"/>
       <w:r>
         <w:rPr>
           <w:rFonts w:ascii="Arial" w:hAnsi="Arial"/>
@@ -1539,7 +1156,6 @@
         </w:rPr>
         <w:t>innerHTML</w:t>
       </w:r>
-      <w:proofErr w:type="spellEnd"/>
       <w:r>
         <w:rPr>
           <w:rFonts w:ascii="Arial" w:hAnsi="Arial"/>
@@ -1751,42 +1367,15 @@
           <w:sz w:val="28"/>
           <w:szCs w:val="28"/>
         </w:rPr>
-        <w:t xml:space="preserve">É possível alterar atributos de elementos HTML pelo JS, como o </w:t>
-      </w:r>
-      <w:proofErr w:type="spellStart"/>
-      <w:r>
-        <w:rPr>
-          <w:rFonts w:ascii="Arial" w:hAnsi="Arial"/>
-          <w:sz w:val="28"/>
-          <w:szCs w:val="28"/>
-        </w:rPr>
-        <w:t>src</w:t>
-      </w:r>
-      <w:proofErr w:type="spellEnd"/>
-      <w:r>
-        <w:rPr>
-          <w:rFonts w:ascii="Arial" w:hAnsi="Arial"/>
-          <w:sz w:val="28"/>
-          <w:szCs w:val="28"/>
-        </w:rPr>
-        <w:t xml:space="preserve"> de uma imagem, o link de um texto, ou um alt. </w:t>
-      </w:r>
-      <w:r>
-        <w:rPr>
-          <w:rFonts w:ascii="Arial" w:hAnsi="Arial"/>
-          <w:sz w:val="28"/>
-          <w:szCs w:val="28"/>
-        </w:rPr>
-        <w:t>Para fazer isso, o JS precisa ler (</w:t>
-      </w:r>
-      <w:proofErr w:type="spellStart"/>
-      <w:r>
-        <w:rPr>
-          <w:rFonts w:ascii="Arial" w:hAnsi="Arial"/>
-          <w:sz w:val="28"/>
-          <w:szCs w:val="28"/>
-        </w:rPr>
-        <w:t>getAt</w:t>
+        <w:t xml:space="preserve">É possível alterar atributos de elementos HTML pelo JS, como o src de uma imagem, o link de um texto, ou um alt. </w:t>
+      </w:r>
+      <w:r>
+        <w:rPr>
+          <w:rFonts w:ascii="Arial" w:hAnsi="Arial"/>
+          <w:sz w:val="28"/>
+          <w:szCs w:val="28"/>
+        </w:rPr>
+        <w:t>Para fazer isso, o JS precisa ler (getAt</w:t>
       </w:r>
       <w:r>
         <w:rPr>
@@ -1812,7 +1401,6 @@
         </w:rPr>
         <w:t>e</w:t>
       </w:r>
-      <w:proofErr w:type="spellEnd"/>
       <w:r>
         <w:rPr>
           <w:rFonts w:ascii="Arial" w:hAnsi="Arial"/>
@@ -1827,44 +1415,16 @@
           <w:sz w:val="28"/>
           <w:szCs w:val="28"/>
         </w:rPr>
-        <w:t>e/ou alterar (</w:t>
-      </w:r>
-      <w:proofErr w:type="spellStart"/>
-      <w:r>
-        <w:rPr>
-          <w:rFonts w:ascii="Arial" w:hAnsi="Arial"/>
-          <w:sz w:val="28"/>
-          <w:szCs w:val="28"/>
-        </w:rPr>
-        <w:t>setAtt</w:t>
-      </w:r>
-      <w:r>
-        <w:rPr>
-          <w:rFonts w:ascii="Arial" w:hAnsi="Arial"/>
-          <w:sz w:val="28"/>
-          <w:szCs w:val="28"/>
-        </w:rPr>
-        <w:t>ribute</w:t>
-      </w:r>
-      <w:proofErr w:type="spellEnd"/>
-      <w:r>
-        <w:rPr>
-          <w:rFonts w:ascii="Arial" w:hAnsi="Arial"/>
-          <w:sz w:val="28"/>
-          <w:szCs w:val="28"/>
-        </w:rPr>
-        <w:t xml:space="preserve">), como trocar uma imagem de forma </w:t>
-      </w:r>
-      <w:proofErr w:type="spellStart"/>
-      <w:r>
-        <w:rPr>
-          <w:rFonts w:ascii="Arial" w:hAnsi="Arial"/>
-          <w:sz w:val="28"/>
-          <w:szCs w:val="28"/>
-        </w:rPr>
-        <w:t>dinâmino</w:t>
-      </w:r>
-      <w:proofErr w:type="spellEnd"/>
+        <w:t>e/ou alterar (setAtt</w:t>
+      </w:r>
+      <w:r>
+        <w:rPr>
+          <w:rFonts w:ascii="Arial" w:hAnsi="Arial"/>
+          <w:sz w:val="28"/>
+          <w:szCs w:val="28"/>
+        </w:rPr>
+        <w:t>ribute), como trocar uma imagem de forma dinâmino</w:t>
+      </w:r>
     </w:p>
     <w:p>
       <w:pPr>
@@ -1948,6 +1508,7 @@
           <w:rFonts w:ascii="Arial" w:hAnsi="Arial"/>
           <w:b/>
           <w:bCs/>
+          <w:noProof/>
           <w:sz w:val="28"/>
           <w:szCs w:val="28"/>
         </w:rPr>
@@ -2003,6 +1564,7 @@
           <w:rFonts w:ascii="Arial" w:hAnsi="Arial"/>
           <w:b/>
           <w:bCs/>
+          <w:noProof/>
           <w:sz w:val="28"/>
           <w:szCs w:val="28"/>
         </w:rPr>
@@ -2111,6 +1673,7 @@
           <w:rFonts w:ascii="Arial" w:hAnsi="Arial"/>
           <w:b/>
           <w:bCs/>
+          <w:noProof/>
           <w:sz w:val="28"/>
           <w:szCs w:val="28"/>
         </w:rPr>
@@ -2179,6 +1742,7 @@
       <w:r>
         <w:rPr>
           <w:rFonts w:ascii="Arial" w:hAnsi="Arial"/>
+          <w:noProof/>
           <w:sz w:val="28"/>
           <w:szCs w:val="28"/>
         </w:rPr>
@@ -2247,6 +1811,7 @@
       <w:r>
         <w:rPr>
           <w:rFonts w:ascii="Arial" w:hAnsi="Arial"/>
+          <w:noProof/>
           <w:sz w:val="28"/>
           <w:szCs w:val="28"/>
         </w:rPr>
@@ -2375,61 +1940,15 @@
           <w:sz w:val="28"/>
           <w:szCs w:val="28"/>
         </w:rPr>
-        <w:t>utilize “</w:t>
-      </w:r>
-      <w:proofErr w:type="spellStart"/>
-      <w:proofErr w:type="gramStart"/>
-      <w:r>
-        <w:rPr>
-          <w:rFonts w:ascii="Arial" w:hAnsi="Arial"/>
-          <w:sz w:val="28"/>
-          <w:szCs w:val="28"/>
-        </w:rPr>
-        <w:t>elemento.style</w:t>
-      </w:r>
-      <w:proofErr w:type="gramEnd"/>
-      <w:r>
-        <w:rPr>
-          <w:rFonts w:ascii="Arial" w:hAnsi="Arial"/>
-          <w:sz w:val="28"/>
-          <w:szCs w:val="28"/>
-        </w:rPr>
-        <w:t>.</w:t>
-      </w:r>
-      <w:r>
-        <w:rPr>
-          <w:rFonts w:ascii="Arial" w:hAnsi="Arial"/>
-          <w:sz w:val="28"/>
-          <w:szCs w:val="28"/>
-        </w:rPr>
-        <w:t>estiloAlterado</w:t>
-      </w:r>
-      <w:proofErr w:type="spellEnd"/>
-      <w:r>
-        <w:rPr>
-          <w:rFonts w:ascii="Arial" w:hAnsi="Arial"/>
-          <w:sz w:val="28"/>
-          <w:szCs w:val="28"/>
-        </w:rPr>
-        <w:t xml:space="preserve">”, com cuidado, pois poluí com estilos </w:t>
-      </w:r>
-      <w:proofErr w:type="spellStart"/>
-      <w:r>
-        <w:rPr>
-          <w:rFonts w:ascii="Arial" w:hAnsi="Arial"/>
-          <w:sz w:val="28"/>
-          <w:szCs w:val="28"/>
-        </w:rPr>
-        <w:t>inline</w:t>
-      </w:r>
-      <w:proofErr w:type="spellEnd"/>
-      <w:r>
-        <w:rPr>
-          <w:rFonts w:ascii="Arial" w:hAnsi="Arial"/>
-          <w:sz w:val="28"/>
-          <w:szCs w:val="28"/>
-        </w:rPr>
-        <w:t>.</w:t>
+        <w:t>utilize “elemento.style.</w:t>
+      </w:r>
+      <w:r>
+        <w:rPr>
+          <w:rFonts w:ascii="Arial" w:hAnsi="Arial"/>
+          <w:sz w:val="28"/>
+          <w:szCs w:val="28"/>
+        </w:rPr>
+        <w:t>estiloAlterado”, com cuidado, pois poluí com estilos inline.</w:t>
       </w:r>
     </w:p>
     <w:p>
@@ -2460,6 +1979,7 @@
       <w:r>
         <w:rPr>
           <w:rFonts w:ascii="Arial" w:hAnsi="Arial"/>
+          <w:noProof/>
           <w:sz w:val="28"/>
           <w:szCs w:val="28"/>
         </w:rPr>
@@ -2511,6 +2031,7 @@
       <w:r>
         <w:rPr>
           <w:rFonts w:ascii="Arial" w:hAnsi="Arial"/>
+          <w:noProof/>
           <w:sz w:val="28"/>
           <w:szCs w:val="28"/>
         </w:rPr>
@@ -2553,6 +2074,7 @@
       <w:r>
         <w:rPr>
           <w:rFonts w:ascii="Arial" w:hAnsi="Arial"/>
+          <w:noProof/>
           <w:sz w:val="28"/>
           <w:szCs w:val="28"/>
         </w:rPr>
@@ -2667,7 +2189,6 @@
         </w:rPr>
         <w:t xml:space="preserve">A prática atual utilizada é o </w:t>
       </w:r>
-      <w:proofErr w:type="spellStart"/>
       <w:r>
         <w:rPr>
           <w:rFonts w:ascii="Arial" w:hAnsi="Arial"/>
@@ -2678,7 +2199,6 @@
         </w:rPr>
         <w:t>classList</w:t>
       </w:r>
-      <w:proofErr w:type="spellEnd"/>
       <w:r>
         <w:rPr>
           <w:rFonts w:ascii="Arial" w:hAnsi="Arial"/>
@@ -2705,7 +2225,6 @@
         </w:rPr>
         <w:t xml:space="preserve"> cria os estilos no arquivo CSS, e apenas utiliza o </w:t>
       </w:r>
-      <w:proofErr w:type="spellStart"/>
       <w:r>
         <w:rPr>
           <w:rFonts w:ascii="Arial" w:hAnsi="Arial"/>
@@ -2716,7 +2235,6 @@
         </w:rPr>
         <w:t>classList</w:t>
       </w:r>
-      <w:proofErr w:type="spellEnd"/>
       <w:r>
         <w:rPr>
           <w:rFonts w:ascii="Arial" w:hAnsi="Arial"/>
@@ -2745,6 +2263,7 @@
       <w:r>
         <w:rPr>
           <w:rFonts w:ascii="Arial" w:hAnsi="Arial"/>
+          <w:noProof/>
           <w:sz w:val="28"/>
           <w:szCs w:val="28"/>
         </w:rPr>
@@ -2821,6 +2340,7 @@
           <w:rFonts w:ascii="Arial" w:hAnsi="Arial"/>
           <w:b/>
           <w:bCs/>
+          <w:noProof/>
           <w:sz w:val="28"/>
           <w:szCs w:val="28"/>
         </w:rPr>
@@ -2876,6 +2396,7 @@
           <w:rFonts w:ascii="Arial" w:hAnsi="Arial"/>
           <w:b/>
           <w:bCs/>
+          <w:noProof/>
           <w:sz w:val="28"/>
           <w:szCs w:val="28"/>
         </w:rPr>
@@ -2931,6 +2452,7 @@
           <w:rFonts w:ascii="Arial" w:hAnsi="Arial"/>
           <w:b/>
           <w:bCs/>
+          <w:noProof/>
           <w:sz w:val="28"/>
           <w:szCs w:val="28"/>
         </w:rPr>
@@ -2992,49 +2514,58 @@
           <w:szCs w:val="28"/>
         </w:rPr>
       </w:pPr>
-      <w:r>
-        <w:rPr>
-          <w:rFonts w:ascii="Arial" w:hAnsi="Arial"/>
-          <w:b/>
-          <w:bCs/>
-          <w:sz w:val="28"/>
-          <w:szCs w:val="28"/>
-        </w:rPr>
-        <w:t>.</w:t>
-      </w:r>
-      <w:proofErr w:type="spellStart"/>
-      <w:proofErr w:type="gramStart"/>
-      <w:r>
-        <w:rPr>
-          <w:rFonts w:ascii="Arial" w:hAnsi="Arial"/>
-          <w:b/>
-          <w:bCs/>
-          <w:sz w:val="28"/>
-          <w:szCs w:val="28"/>
-        </w:rPr>
-        <w:t>value</w:t>
-      </w:r>
-      <w:proofErr w:type="spellEnd"/>
-      <w:r>
-        <w:rPr>
-          <w:rFonts w:ascii="Arial" w:hAnsi="Arial"/>
-          <w:b/>
-          <w:bCs/>
-          <w:sz w:val="28"/>
-          <w:szCs w:val="28"/>
-        </w:rPr>
-        <w:t>(</w:t>
-      </w:r>
-      <w:proofErr w:type="gramEnd"/>
-      <w:r>
-        <w:rPr>
-          <w:rFonts w:ascii="Arial" w:hAnsi="Arial"/>
-          <w:b/>
-          <w:bCs/>
-          <w:sz w:val="28"/>
-          <w:szCs w:val="28"/>
-        </w:rPr>
-        <w:t>)</w:t>
+    </w:p>
+    <w:p>
+      <w:pPr>
+        <w:rPr>
+          <w:rFonts w:ascii="Arial" w:hAnsi="Arial"/>
+          <w:b/>
+          <w:bCs/>
+          <w:sz w:val="28"/>
+          <w:szCs w:val="28"/>
+        </w:rPr>
+      </w:pPr>
+    </w:p>
+    <w:p>
+      <w:pPr>
+        <w:rPr>
+          <w:rFonts w:ascii="Arial" w:hAnsi="Arial"/>
+          <w:b/>
+          <w:bCs/>
+          <w:sz w:val="28"/>
+          <w:szCs w:val="28"/>
+        </w:rPr>
+      </w:pPr>
+    </w:p>
+    <w:p>
+      <w:pPr>
+        <w:rPr>
+          <w:rFonts w:ascii="Arial" w:hAnsi="Arial"/>
+          <w:b/>
+          <w:bCs/>
+          <w:sz w:val="28"/>
+          <w:szCs w:val="28"/>
+        </w:rPr>
+      </w:pPr>
+    </w:p>
+    <w:p>
+      <w:pPr>
+        <w:rPr>
+          <w:rFonts w:ascii="Arial" w:hAnsi="Arial"/>
+          <w:sz w:val="28"/>
+          <w:szCs w:val="28"/>
+        </w:rPr>
+      </w:pPr>
+      <w:r>
+        <w:rPr>
+          <w:rFonts w:ascii="Arial" w:hAnsi="Arial"/>
+          <w:b/>
+          <w:bCs/>
+          <w:sz w:val="28"/>
+          <w:szCs w:val="28"/>
+        </w:rPr>
+        <w:lastRenderedPageBreak/>
+        <w:t>.value()</w:t>
       </w:r>
       <w:r>
         <w:rPr>
@@ -3046,50 +2577,129 @@
         </w:rPr>
         <w:t xml:space="preserve"> – Captura de Dados</w:t>
       </w:r>
-    </w:p>
-    <w:p>
-      <w:pPr>
-        <w:rPr>
-          <w:rFonts w:ascii="Arial" w:hAnsi="Arial"/>
-          <w:b/>
-          <w:bCs/>
-          <w:sz w:val="28"/>
-          <w:szCs w:val="28"/>
-        </w:rPr>
-      </w:pPr>
-      <w:proofErr w:type="spellStart"/>
-      <w:proofErr w:type="gramStart"/>
-      <w:r>
-        <w:rPr>
-          <w:rFonts w:ascii="Arial" w:hAnsi="Arial"/>
-          <w:b/>
-          <w:bCs/>
-          <w:sz w:val="28"/>
-          <w:szCs w:val="28"/>
-        </w:rPr>
-        <w:t>Number</w:t>
-      </w:r>
-      <w:proofErr w:type="spellEnd"/>
-      <w:r>
-        <w:rPr>
-          <w:rFonts w:ascii="Arial" w:hAnsi="Arial"/>
-          <w:b/>
-          <w:bCs/>
-          <w:sz w:val="28"/>
-          <w:szCs w:val="28"/>
-        </w:rPr>
-        <w:t>(</w:t>
-      </w:r>
-      <w:proofErr w:type="gramEnd"/>
-      <w:r>
-        <w:rPr>
-          <w:rFonts w:ascii="Arial" w:hAnsi="Arial"/>
-          <w:b/>
-          <w:bCs/>
-          <w:sz w:val="28"/>
-          <w:szCs w:val="28"/>
-        </w:rPr>
-        <w:t>) – Conversão de Dados para número</w:t>
+      <w:r>
+        <w:rPr>
+          <w:rFonts w:ascii="Arial" w:hAnsi="Arial"/>
+          <w:b/>
+          <w:bCs/>
+          <w:sz w:val="28"/>
+          <w:szCs w:val="28"/>
+        </w:rPr>
+        <w:t xml:space="preserve"> – </w:t>
+      </w:r>
+      <w:r>
+        <w:rPr>
+          <w:rFonts w:ascii="Arial" w:hAnsi="Arial"/>
+          <w:sz w:val="28"/>
+          <w:szCs w:val="28"/>
+        </w:rPr>
+        <w:t>Usar quando quiser mudar um texto por outra variável criada. Ex.:</w:t>
+      </w:r>
+    </w:p>
+    <w:p>
+      <w:pPr>
+        <w:rPr>
+          <w:rFonts w:ascii="Arial" w:hAnsi="Arial"/>
+          <w:sz w:val="28"/>
+          <w:szCs w:val="28"/>
+        </w:rPr>
+      </w:pPr>
+      <w:r>
+        <w:rPr>
+          <w:rFonts w:ascii="Arial" w:hAnsi="Arial"/>
+          <w:sz w:val="28"/>
+          <w:szCs w:val="28"/>
+        </w:rPr>
+        <w:drawing>
+          <wp:inline distT="0" distB="0" distL="0" distR="0" wp14:anchorId="6E4D1BDB" wp14:editId="45ABB99A">
+            <wp:extent cx="5400040" cy="2025015"/>
+            <wp:effectExtent l="0" t="0" r="0" b="0"/>
+            <wp:docPr id="1249556984" name="Imagem 1"/>
+            <wp:cNvGraphicFramePr>
+              <a:graphicFrameLocks xmlns:a="http://schemas.openxmlformats.org/drawingml/2006/main" noChangeAspect="1"/>
+            </wp:cNvGraphicFramePr>
+            <a:graphic xmlns:a="http://schemas.openxmlformats.org/drawingml/2006/main">
+              <a:graphicData uri="http://schemas.openxmlformats.org/drawingml/2006/picture">
+                <pic:pic xmlns:pic="http://schemas.openxmlformats.org/drawingml/2006/picture">
+                  <pic:nvPicPr>
+                    <pic:cNvPr id="1249556984" name=""/>
+                    <pic:cNvPicPr/>
+                  </pic:nvPicPr>
+                  <pic:blipFill>
+                    <a:blip r:embed="rId19"/>
+                    <a:stretch>
+                      <a:fillRect/>
+                    </a:stretch>
+                  </pic:blipFill>
+                  <pic:spPr>
+                    <a:xfrm>
+                      <a:off x="0" y="0"/>
+                      <a:ext cx="5400040" cy="2025015"/>
+                    </a:xfrm>
+                    <a:prstGeom prst="rect">
+                      <a:avLst/>
+                    </a:prstGeom>
+                  </pic:spPr>
+                </pic:pic>
+              </a:graphicData>
+            </a:graphic>
+          </wp:inline>
+        </w:drawing>
+      </w:r>
+    </w:p>
+    <w:p>
+      <w:pPr>
+        <w:rPr>
+          <w:rFonts w:ascii="Arial" w:hAnsi="Arial"/>
+          <w:sz w:val="28"/>
+          <w:szCs w:val="28"/>
+        </w:rPr>
+      </w:pPr>
+      <w:r>
+        <w:rPr>
+          <w:rFonts w:ascii="Arial" w:hAnsi="Arial"/>
+          <w:sz w:val="28"/>
+          <w:szCs w:val="28"/>
+        </w:rPr>
+        <w:t xml:space="preserve">- O que é digitado no campo texto é mostrado </w:t>
+      </w:r>
+      <w:r>
+        <w:rPr>
+          <w:rFonts w:ascii="Arial" w:hAnsi="Arial"/>
+          <w:sz w:val="28"/>
+          <w:szCs w:val="28"/>
+        </w:rPr>
+        <w:t>no preview, pois o .value pega os dados digitados.</w:t>
+      </w:r>
+    </w:p>
+    <w:p>
+      <w:pPr>
+        <w:rPr>
+          <w:rFonts w:ascii="Arial" w:hAnsi="Arial"/>
+          <w:sz w:val="28"/>
+          <w:szCs w:val="28"/>
+        </w:rPr>
+      </w:pPr>
+    </w:p>
+    <w:p>
+      <w:pPr>
+        <w:rPr>
+          <w:rFonts w:ascii="Arial" w:hAnsi="Arial"/>
+          <w:b/>
+          <w:bCs/>
+          <w:sz w:val="28"/>
+          <w:szCs w:val="28"/>
+        </w:rPr>
+      </w:pPr>
+      <w:r>
+        <w:rPr>
+          <w:rFonts w:ascii="Arial" w:hAnsi="Arial"/>
+          <w:b/>
+          <w:bCs/>
+          <w:sz w:val="28"/>
+          <w:szCs w:val="28"/>
+        </w:rPr>
+        <w:t>Number() – Conversão de Dados para número</w:t>
       </w:r>
     </w:p>
     <w:p>

</xml_diff>